<commit_message>
Multi stream models added Docs and references added Several tools added Thermopackages upgraded Binary Phase Env upgraded Modelling Guide added And Readme upgraded
</commit_message>
<xml_diff>
--- a/docs/00 Docs/00 OpenModellica for Process Simulations.docx
+++ b/docs/00 Docs/00 OpenModellica for Process Simulations.docx
@@ -1079,7 +1079,7 @@
           <w:r>
             <w:fldChar w:fldCharType="separate"/>
           </w:r>
-          <w:hyperlink w:anchor="_Toc239257586" w:history="1">
+          <w:hyperlink w:anchor="_Toc239415423" w:history="1">
             <w:r>
               <w:rPr>
                 <w:rStyle w:val="Hyperlink"/>
@@ -1123,7 +1123,7 @@
                 <w:noProof/>
                 <w:webHidden/>
               </w:rPr>
-              <w:instrText xml:space="preserve"> PAGEREF _Toc239257586 \h </w:instrText>
+              <w:instrText xml:space="preserve"> PAGEREF _Toc239415423 \h </w:instrText>
             </w:r>
             <w:r>
               <w:rPr>
@@ -1169,7 +1169,7 @@
               <w14:ligatures w14:val="standardContextual"/>
             </w:rPr>
           </w:pPr>
-          <w:hyperlink w:anchor="_Toc239257587" w:history="1">
+          <w:hyperlink w:anchor="_Toc239415424" w:history="1">
             <w:r>
               <w:rPr>
                 <w:rStyle w:val="Hyperlink"/>
@@ -1213,7 +1213,7 @@
                 <w:noProof/>
                 <w:webHidden/>
               </w:rPr>
-              <w:instrText xml:space="preserve"> PAGEREF _Toc239257587 \h </w:instrText>
+              <w:instrText xml:space="preserve"> PAGEREF _Toc239415424 \h </w:instrText>
             </w:r>
             <w:r>
               <w:rPr>
@@ -1259,7 +1259,7 @@
               <w14:ligatures w14:val="standardContextual"/>
             </w:rPr>
           </w:pPr>
-          <w:hyperlink w:anchor="_Toc239257588" w:history="1">
+          <w:hyperlink w:anchor="_Toc239415425" w:history="1">
             <w:r>
               <w:rPr>
                 <w:rStyle w:val="Hyperlink"/>
@@ -1303,7 +1303,7 @@
                 <w:noProof/>
                 <w:webHidden/>
               </w:rPr>
-              <w:instrText xml:space="preserve"> PAGEREF _Toc239257588 \h </w:instrText>
+              <w:instrText xml:space="preserve"> PAGEREF _Toc239415425 \h </w:instrText>
             </w:r>
             <w:r>
               <w:rPr>
@@ -1349,7 +1349,7 @@
               <w14:ligatures w14:val="standardContextual"/>
             </w:rPr>
           </w:pPr>
-          <w:hyperlink w:anchor="_Toc239257589" w:history="1">
+          <w:hyperlink w:anchor="_Toc239415426" w:history="1">
             <w:r>
               <w:rPr>
                 <w:rStyle w:val="Hyperlink"/>
@@ -1393,7 +1393,7 @@
                 <w:noProof/>
                 <w:webHidden/>
               </w:rPr>
-              <w:instrText xml:space="preserve"> PAGEREF _Toc239257589 \h </w:instrText>
+              <w:instrText xml:space="preserve"> PAGEREF _Toc239415426 \h </w:instrText>
             </w:r>
             <w:r>
               <w:rPr>
@@ -1439,7 +1439,7 @@
               <w14:ligatures w14:val="standardContextual"/>
             </w:rPr>
           </w:pPr>
-          <w:hyperlink w:anchor="_Toc239257590" w:history="1">
+          <w:hyperlink w:anchor="_Toc239415427" w:history="1">
             <w:r>
               <w:rPr>
                 <w:rStyle w:val="Hyperlink"/>
@@ -1483,7 +1483,7 @@
                 <w:noProof/>
                 <w:webHidden/>
               </w:rPr>
-              <w:instrText xml:space="preserve"> PAGEREF _Toc239257590 \h </w:instrText>
+              <w:instrText xml:space="preserve"> PAGEREF _Toc239415427 \h </w:instrText>
             </w:r>
             <w:r>
               <w:rPr>
@@ -1529,7 +1529,7 @@
               <w14:ligatures w14:val="standardContextual"/>
             </w:rPr>
           </w:pPr>
-          <w:hyperlink w:anchor="_Toc239257591" w:history="1">
+          <w:hyperlink w:anchor="_Toc239415428" w:history="1">
             <w:r>
               <w:rPr>
                 <w:rStyle w:val="Hyperlink"/>
@@ -1573,7 +1573,7 @@
                 <w:noProof/>
                 <w:webHidden/>
               </w:rPr>
-              <w:instrText xml:space="preserve"> PAGEREF _Toc239257591 \h </w:instrText>
+              <w:instrText xml:space="preserve"> PAGEREF _Toc239415428 \h </w:instrText>
             </w:r>
             <w:r>
               <w:rPr>
@@ -1619,7 +1619,7 @@
               <w14:ligatures w14:val="standardContextual"/>
             </w:rPr>
           </w:pPr>
-          <w:hyperlink w:anchor="_Toc239257592" w:history="1">
+          <w:hyperlink w:anchor="_Toc239415429" w:history="1">
             <w:r>
               <w:rPr>
                 <w:rStyle w:val="Hyperlink"/>
@@ -1663,7 +1663,7 @@
                 <w:noProof/>
                 <w:webHidden/>
               </w:rPr>
-              <w:instrText xml:space="preserve"> PAGEREF _Toc239257592 \h </w:instrText>
+              <w:instrText xml:space="preserve"> PAGEREF _Toc239415429 \h </w:instrText>
             </w:r>
             <w:r>
               <w:rPr>
@@ -1709,7 +1709,7 @@
               <w14:ligatures w14:val="standardContextual"/>
             </w:rPr>
           </w:pPr>
-          <w:hyperlink w:anchor="_Toc239257593" w:history="1">
+          <w:hyperlink w:anchor="_Toc239415430" w:history="1">
             <w:r>
               <w:rPr>
                 <w:rStyle w:val="Hyperlink"/>
@@ -1753,7 +1753,7 @@
                 <w:noProof/>
                 <w:webHidden/>
               </w:rPr>
-              <w:instrText xml:space="preserve"> PAGEREF _Toc239257593 \h </w:instrText>
+              <w:instrText xml:space="preserve"> PAGEREF _Toc239415430 \h </w:instrText>
             </w:r>
             <w:r>
               <w:rPr>
@@ -1799,7 +1799,7 @@
               <w14:ligatures w14:val="standardContextual"/>
             </w:rPr>
           </w:pPr>
-          <w:hyperlink w:anchor="_Toc239257594" w:history="1">
+          <w:hyperlink w:anchor="_Toc239415431" w:history="1">
             <w:r>
               <w:rPr>
                 <w:rStyle w:val="Hyperlink"/>
@@ -1843,7 +1843,7 @@
                 <w:noProof/>
                 <w:webHidden/>
               </w:rPr>
-              <w:instrText xml:space="preserve"> PAGEREF _Toc239257594 \h </w:instrText>
+              <w:instrText xml:space="preserve"> PAGEREF _Toc239415431 \h </w:instrText>
             </w:r>
             <w:r>
               <w:rPr>
@@ -1863,7 +1863,7 @@
                 <w:noProof/>
                 <w:webHidden/>
               </w:rPr>
-              <w:t>9</w:t>
+              <w:t>8</w:t>
             </w:r>
             <w:r>
               <w:rPr>
@@ -1889,7 +1889,7 @@
               <w14:ligatures w14:val="standardContextual"/>
             </w:rPr>
           </w:pPr>
-          <w:hyperlink w:anchor="_Toc239257595" w:history="1">
+          <w:hyperlink w:anchor="_Toc239415432" w:history="1">
             <w:r>
               <w:rPr>
                 <w:rStyle w:val="Hyperlink"/>
@@ -1933,7 +1933,7 @@
                 <w:noProof/>
                 <w:webHidden/>
               </w:rPr>
-              <w:instrText xml:space="preserve"> PAGEREF _Toc239257595 \h </w:instrText>
+              <w:instrText xml:space="preserve"> PAGEREF _Toc239415432 \h </w:instrText>
             </w:r>
             <w:r>
               <w:rPr>
@@ -1979,7 +1979,7 @@
               <w14:ligatures w14:val="standardContextual"/>
             </w:rPr>
           </w:pPr>
-          <w:hyperlink w:anchor="_Toc239257596" w:history="1">
+          <w:hyperlink w:anchor="_Toc239415433" w:history="1">
             <w:r>
               <w:rPr>
                 <w:rStyle w:val="Hyperlink"/>
@@ -2023,7 +2023,7 @@
                 <w:noProof/>
                 <w:webHidden/>
               </w:rPr>
-              <w:instrText xml:space="preserve"> PAGEREF _Toc239257596 \h </w:instrText>
+              <w:instrText xml:space="preserve"> PAGEREF _Toc239415433 \h </w:instrText>
             </w:r>
             <w:r>
               <w:rPr>
@@ -2069,7 +2069,7 @@
               <w14:ligatures w14:val="standardContextual"/>
             </w:rPr>
           </w:pPr>
-          <w:hyperlink w:anchor="_Toc239257597" w:history="1">
+          <w:hyperlink w:anchor="_Toc239415434" w:history="1">
             <w:r>
               <w:rPr>
                 <w:rStyle w:val="Hyperlink"/>
@@ -2113,7 +2113,7 @@
                 <w:noProof/>
                 <w:webHidden/>
               </w:rPr>
-              <w:instrText xml:space="preserve"> PAGEREF _Toc239257597 \h </w:instrText>
+              <w:instrText xml:space="preserve"> PAGEREF _Toc239415434 \h </w:instrText>
             </w:r>
             <w:r>
               <w:rPr>
@@ -2159,7 +2159,7 @@
               <w14:ligatures w14:val="standardContextual"/>
             </w:rPr>
           </w:pPr>
-          <w:hyperlink w:anchor="_Toc239257598" w:history="1">
+          <w:hyperlink w:anchor="_Toc239415435" w:history="1">
             <w:r>
               <w:rPr>
                 <w:rStyle w:val="Hyperlink"/>
@@ -2203,7 +2203,7 @@
                 <w:noProof/>
                 <w:webHidden/>
               </w:rPr>
-              <w:instrText xml:space="preserve"> PAGEREF _Toc239257598 \h </w:instrText>
+              <w:instrText xml:space="preserve"> PAGEREF _Toc239415435 \h </w:instrText>
             </w:r>
             <w:r>
               <w:rPr>
@@ -2249,7 +2249,7 @@
               <w14:ligatures w14:val="standardContextual"/>
             </w:rPr>
           </w:pPr>
-          <w:hyperlink w:anchor="_Toc239257599" w:history="1">
+          <w:hyperlink w:anchor="_Toc239415436" w:history="1">
             <w:r>
               <w:rPr>
                 <w:rStyle w:val="Hyperlink"/>
@@ -2293,7 +2293,7 @@
                 <w:noProof/>
                 <w:webHidden/>
               </w:rPr>
-              <w:instrText xml:space="preserve"> PAGEREF _Toc239257599 \h </w:instrText>
+              <w:instrText xml:space="preserve"> PAGEREF _Toc239415436 \h </w:instrText>
             </w:r>
             <w:r>
               <w:rPr>
@@ -2339,7 +2339,7 @@
               <w14:ligatures w14:val="standardContextual"/>
             </w:rPr>
           </w:pPr>
-          <w:hyperlink w:anchor="_Toc239257600" w:history="1">
+          <w:hyperlink w:anchor="_Toc239415437" w:history="1">
             <w:r>
               <w:rPr>
                 <w:rStyle w:val="Hyperlink"/>
@@ -2362,7 +2362,7 @@
                 <w:rStyle w:val="Hyperlink"/>
                 <w:noProof/>
               </w:rPr>
-              <w:t>The Building Blocks – Modelica Language Basics</w:t>
+              <w:t>The Building Blocks, Modelica Language Basics</w:t>
             </w:r>
             <w:r>
               <w:rPr>
@@ -2383,7 +2383,7 @@
                 <w:noProof/>
                 <w:webHidden/>
               </w:rPr>
-              <w:instrText xml:space="preserve"> PAGEREF _Toc239257600 \h </w:instrText>
+              <w:instrText xml:space="preserve"> PAGEREF _Toc239415437 \h </w:instrText>
             </w:r>
             <w:r>
               <w:rPr>
@@ -2403,7 +2403,7 @@
                 <w:noProof/>
                 <w:webHidden/>
               </w:rPr>
-              <w:t>12</w:t>
+              <w:t>13</w:t>
             </w:r>
             <w:r>
               <w:rPr>
@@ -2429,7 +2429,7 @@
               <w14:ligatures w14:val="standardContextual"/>
             </w:rPr>
           </w:pPr>
-          <w:hyperlink w:anchor="_Toc239257601" w:history="1">
+          <w:hyperlink w:anchor="_Toc239415438" w:history="1">
             <w:r>
               <w:rPr>
                 <w:rStyle w:val="Hyperlink"/>
@@ -2473,7 +2473,7 @@
                 <w:noProof/>
                 <w:webHidden/>
               </w:rPr>
-              <w:instrText xml:space="preserve"> PAGEREF _Toc239257601 \h </w:instrText>
+              <w:instrText xml:space="preserve"> PAGEREF _Toc239415438 \h </w:instrText>
             </w:r>
             <w:r>
               <w:rPr>
@@ -2519,7 +2519,7 @@
               <w14:ligatures w14:val="standardContextual"/>
             </w:rPr>
           </w:pPr>
-          <w:hyperlink w:anchor="_Toc239257602" w:history="1">
+          <w:hyperlink w:anchor="_Toc239415439" w:history="1">
             <w:r>
               <w:rPr>
                 <w:rStyle w:val="Hyperlink"/>
@@ -2563,7 +2563,7 @@
                 <w:noProof/>
                 <w:webHidden/>
               </w:rPr>
-              <w:instrText xml:space="preserve"> PAGEREF _Toc239257602 \h </w:instrText>
+              <w:instrText xml:space="preserve"> PAGEREF _Toc239415439 \h </w:instrText>
             </w:r>
             <w:r>
               <w:rPr>
@@ -2609,7 +2609,7 @@
               <w14:ligatures w14:val="standardContextual"/>
             </w:rPr>
           </w:pPr>
-          <w:hyperlink w:anchor="_Toc239257603" w:history="1">
+          <w:hyperlink w:anchor="_Toc239415440" w:history="1">
             <w:r>
               <w:rPr>
                 <w:rStyle w:val="Hyperlink"/>
@@ -2653,7 +2653,7 @@
                 <w:noProof/>
                 <w:webHidden/>
               </w:rPr>
-              <w:instrText xml:space="preserve"> PAGEREF _Toc239257603 \h </w:instrText>
+              <w:instrText xml:space="preserve"> PAGEREF _Toc239415440 \h </w:instrText>
             </w:r>
             <w:r>
               <w:rPr>
@@ -2699,7 +2699,7 @@
               <w14:ligatures w14:val="standardContextual"/>
             </w:rPr>
           </w:pPr>
-          <w:hyperlink w:anchor="_Toc239257604" w:history="1">
+          <w:hyperlink w:anchor="_Toc239415441" w:history="1">
             <w:r>
               <w:rPr>
                 <w:rStyle w:val="Hyperlink"/>
@@ -2743,7 +2743,7 @@
                 <w:noProof/>
                 <w:webHidden/>
               </w:rPr>
-              <w:instrText xml:space="preserve"> PAGEREF _Toc239257604 \h </w:instrText>
+              <w:instrText xml:space="preserve"> PAGEREF _Toc239415441 \h </w:instrText>
             </w:r>
             <w:r>
               <w:rPr>
@@ -2789,7 +2789,7 @@
               <w14:ligatures w14:val="standardContextual"/>
             </w:rPr>
           </w:pPr>
-          <w:hyperlink w:anchor="_Toc239257605" w:history="1">
+          <w:hyperlink w:anchor="_Toc239415442" w:history="1">
             <w:r>
               <w:rPr>
                 <w:rStyle w:val="Hyperlink"/>
@@ -2833,7 +2833,7 @@
                 <w:noProof/>
                 <w:webHidden/>
               </w:rPr>
-              <w:instrText xml:space="preserve"> PAGEREF _Toc239257605 \h </w:instrText>
+              <w:instrText xml:space="preserve"> PAGEREF _Toc239415442 \h </w:instrText>
             </w:r>
             <w:r>
               <w:rPr>
@@ -2853,7 +2853,7 @@
                 <w:noProof/>
                 <w:webHidden/>
               </w:rPr>
-              <w:t>15</w:t>
+              <w:t>16</w:t>
             </w:r>
             <w:r>
               <w:rPr>
@@ -2879,7 +2879,7 @@
               <w14:ligatures w14:val="standardContextual"/>
             </w:rPr>
           </w:pPr>
-          <w:hyperlink w:anchor="_Toc239257606" w:history="1">
+          <w:hyperlink w:anchor="_Toc239415443" w:history="1">
             <w:r>
               <w:rPr>
                 <w:rStyle w:val="Hyperlink"/>
@@ -2923,7 +2923,7 @@
                 <w:noProof/>
                 <w:webHidden/>
               </w:rPr>
-              <w:instrText xml:space="preserve"> PAGEREF _Toc239257606 \h </w:instrText>
+              <w:instrText xml:space="preserve"> PAGEREF _Toc239415443 \h </w:instrText>
             </w:r>
             <w:r>
               <w:rPr>
@@ -2969,7 +2969,7 @@
               <w14:ligatures w14:val="standardContextual"/>
             </w:rPr>
           </w:pPr>
-          <w:hyperlink w:anchor="_Toc239257607" w:history="1">
+          <w:hyperlink w:anchor="_Toc239415444" w:history="1">
             <w:r>
               <w:rPr>
                 <w:rStyle w:val="Hyperlink"/>
@@ -2992,7 +2992,7 @@
                 <w:rStyle w:val="Hyperlink"/>
                 <w:noProof/>
               </w:rPr>
-              <w:t xml:space="preserve">Exporting Simulation Data – A Deep Dive Using </w:t>
+              <w:t xml:space="preserve">Exporting Simulation Data, A Deep Dive Using </w:t>
             </w:r>
             <w:r>
               <w:rPr>
@@ -3022,7 +3022,7 @@
                 <w:noProof/>
                 <w:webHidden/>
               </w:rPr>
-              <w:instrText xml:space="preserve"> PAGEREF _Toc239257607 \h </w:instrText>
+              <w:instrText xml:space="preserve"> PAGEREF _Toc239415444 \h </w:instrText>
             </w:r>
             <w:r>
               <w:rPr>
@@ -3042,7 +3042,7 @@
                 <w:noProof/>
                 <w:webHidden/>
               </w:rPr>
-              <w:t>18</w:t>
+              <w:t>19</w:t>
             </w:r>
             <w:r>
               <w:rPr>
@@ -3068,7 +3068,7 @@
               <w14:ligatures w14:val="standardContextual"/>
             </w:rPr>
           </w:pPr>
-          <w:hyperlink w:anchor="_Toc239257608" w:history="1">
+          <w:hyperlink w:anchor="_Toc239415445" w:history="1">
             <w:r>
               <w:rPr>
                 <w:rStyle w:val="Hyperlink"/>
@@ -3112,7 +3112,7 @@
                 <w:noProof/>
                 <w:webHidden/>
               </w:rPr>
-              <w:instrText xml:space="preserve"> PAGEREF _Toc239257608 \h </w:instrText>
+              <w:instrText xml:space="preserve"> PAGEREF _Toc239415445 \h </w:instrText>
             </w:r>
             <w:r>
               <w:rPr>
@@ -3132,7 +3132,7 @@
                 <w:noProof/>
                 <w:webHidden/>
               </w:rPr>
-              <w:t>18</w:t>
+              <w:t>19</w:t>
             </w:r>
             <w:r>
               <w:rPr>
@@ -3158,7 +3158,7 @@
               <w14:ligatures w14:val="standardContextual"/>
             </w:rPr>
           </w:pPr>
-          <w:hyperlink w:anchor="_Toc239257609" w:history="1">
+          <w:hyperlink w:anchor="_Toc239415446" w:history="1">
             <w:r>
               <w:rPr>
                 <w:rStyle w:val="Hyperlink"/>
@@ -3202,7 +3202,7 @@
                 <w:noProof/>
                 <w:webHidden/>
               </w:rPr>
-              <w:instrText xml:space="preserve"> PAGEREF _Toc239257609 \h </w:instrText>
+              <w:instrText xml:space="preserve"> PAGEREF _Toc239415446 \h </w:instrText>
             </w:r>
             <w:r>
               <w:rPr>
@@ -3222,7 +3222,7 @@
                 <w:noProof/>
                 <w:webHidden/>
               </w:rPr>
-              <w:t>19</w:t>
+              <w:t>20</w:t>
             </w:r>
             <w:r>
               <w:rPr>
@@ -3248,7 +3248,7 @@
               <w14:ligatures w14:val="standardContextual"/>
             </w:rPr>
           </w:pPr>
-          <w:hyperlink w:anchor="_Toc239257610" w:history="1">
+          <w:hyperlink w:anchor="_Toc239415447" w:history="1">
             <w:r>
               <w:rPr>
                 <w:rStyle w:val="Hyperlink"/>
@@ -3292,7 +3292,7 @@
                 <w:noProof/>
                 <w:webHidden/>
               </w:rPr>
-              <w:instrText xml:space="preserve"> PAGEREF _Toc239257610 \h </w:instrText>
+              <w:instrText xml:space="preserve"> PAGEREF _Toc239415447 \h </w:instrText>
             </w:r>
             <w:r>
               <w:rPr>
@@ -3312,7 +3312,7 @@
                 <w:noProof/>
                 <w:webHidden/>
               </w:rPr>
-              <w:t>19</w:t>
+              <w:t>20</w:t>
             </w:r>
             <w:r>
               <w:rPr>
@@ -3338,7 +3338,7 @@
               <w14:ligatures w14:val="standardContextual"/>
             </w:rPr>
           </w:pPr>
-          <w:hyperlink w:anchor="_Toc239257611" w:history="1">
+          <w:hyperlink w:anchor="_Toc239415448" w:history="1">
             <w:r>
               <w:rPr>
                 <w:rStyle w:val="Hyperlink"/>
@@ -3382,7 +3382,7 @@
                 <w:noProof/>
                 <w:webHidden/>
               </w:rPr>
-              <w:instrText xml:space="preserve"> PAGEREF _Toc239257611 \h </w:instrText>
+              <w:instrText xml:space="preserve"> PAGEREF _Toc239415448 \h </w:instrText>
             </w:r>
             <w:r>
               <w:rPr>
@@ -3402,7 +3402,7 @@
                 <w:noProof/>
                 <w:webHidden/>
               </w:rPr>
-              <w:t>20</w:t>
+              <w:t>21</w:t>
             </w:r>
             <w:r>
               <w:rPr>
@@ -3428,7 +3428,7 @@
               <w14:ligatures w14:val="standardContextual"/>
             </w:rPr>
           </w:pPr>
-          <w:hyperlink w:anchor="_Toc239257612" w:history="1">
+          <w:hyperlink w:anchor="_Toc239415449" w:history="1">
             <w:r>
               <w:rPr>
                 <w:rStyle w:val="Hyperlink"/>
@@ -3472,7 +3472,7 @@
                 <w:noProof/>
                 <w:webHidden/>
               </w:rPr>
-              <w:instrText xml:space="preserve"> PAGEREF _Toc239257612 \h </w:instrText>
+              <w:instrText xml:space="preserve"> PAGEREF _Toc239415449 \h </w:instrText>
             </w:r>
             <w:r>
               <w:rPr>
@@ -3492,7 +3492,7 @@
                 <w:noProof/>
                 <w:webHidden/>
               </w:rPr>
-              <w:t>21</w:t>
+              <w:t>22</w:t>
             </w:r>
             <w:r>
               <w:rPr>
@@ -3571,7 +3571,7 @@
       <w:r>
         <w:fldChar w:fldCharType="separate"/>
       </w:r>
-      <w:hyperlink w:anchor="_Toc239257081" w:history="1">
+      <w:hyperlink w:anchor="_Toc239415450" w:history="1">
         <w:r>
           <w:rPr>
             <w:rStyle w:val="Hyperlink"/>
@@ -3598,7 +3598,7 @@
             <w:noProof/>
             <w:webHidden/>
           </w:rPr>
-          <w:instrText xml:space="preserve"> PAGEREF _Toc239257081 \h </w:instrText>
+          <w:instrText xml:space="preserve"> PAGEREF _Toc239415450 \h </w:instrText>
         </w:r>
         <w:r>
           <w:rPr>
@@ -3618,7 +3618,7 @@
             <w:noProof/>
             <w:webHidden/>
           </w:rPr>
-          <w:t>9</w:t>
+          <w:t>10</w:t>
         </w:r>
         <w:r>
           <w:rPr>
@@ -3630,6 +3630,1158 @@
       </w:hyperlink>
     </w:p>
     <w:p>
+      <w:pPr>
+        <w:pStyle w:val="TableofFigures"/>
+        <w:tabs>
+          <w:tab w:val="right" w:leader="dot" w:pos="9350"/>
+        </w:tabs>
+        <w:rPr>
+          <w:noProof/>
+          <w:kern w:val="2"/>
+          <w:sz w:val="24"/>
+          <w:szCs w:val="24"/>
+          <w14:ligatures w14:val="standardContextual"/>
+        </w:rPr>
+      </w:pPr>
+      <w:hyperlink w:anchor="_Toc239415451" w:history="1">
+        <w:r>
+          <w:rPr>
+            <w:rStyle w:val="Hyperlink"/>
+            <w:noProof/>
+          </w:rPr>
+          <w:t>Figure 2 Menu Ribbon of OMEdit</w:t>
+        </w:r>
+        <w:r>
+          <w:rPr>
+            <w:noProof/>
+            <w:webHidden/>
+          </w:rPr>
+          <w:tab/>
+        </w:r>
+        <w:r>
+          <w:rPr>
+            <w:noProof/>
+            <w:webHidden/>
+          </w:rPr>
+          <w:fldChar w:fldCharType="begin"/>
+        </w:r>
+        <w:r>
+          <w:rPr>
+            <w:noProof/>
+            <w:webHidden/>
+          </w:rPr>
+          <w:instrText xml:space="preserve"> PAGEREF _Toc239415451 \h </w:instrText>
+        </w:r>
+        <w:r>
+          <w:rPr>
+            <w:noProof/>
+            <w:webHidden/>
+          </w:rPr>
+        </w:r>
+        <w:r>
+          <w:rPr>
+            <w:noProof/>
+            <w:webHidden/>
+          </w:rPr>
+          <w:fldChar w:fldCharType="separate"/>
+        </w:r>
+        <w:r>
+          <w:rPr>
+            <w:noProof/>
+            <w:webHidden/>
+          </w:rPr>
+          <w:t>10</w:t>
+        </w:r>
+        <w:r>
+          <w:rPr>
+            <w:noProof/>
+            <w:webHidden/>
+          </w:rPr>
+          <w:fldChar w:fldCharType="end"/>
+        </w:r>
+      </w:hyperlink>
+    </w:p>
+    <w:p>
+      <w:pPr>
+        <w:pStyle w:val="TableofFigures"/>
+        <w:tabs>
+          <w:tab w:val="right" w:leader="dot" w:pos="9350"/>
+        </w:tabs>
+        <w:rPr>
+          <w:noProof/>
+          <w:kern w:val="2"/>
+          <w:sz w:val="24"/>
+          <w:szCs w:val="24"/>
+          <w14:ligatures w14:val="standardContextual"/>
+        </w:rPr>
+      </w:pPr>
+      <w:hyperlink w:anchor="_Toc239415452" w:history="1">
+        <w:r>
+          <w:rPr>
+            <w:rStyle w:val="Hyperlink"/>
+            <w:noProof/>
+          </w:rPr>
+          <w:t>Figure 3 Toolbar of OMEdit</w:t>
+        </w:r>
+        <w:r>
+          <w:rPr>
+            <w:noProof/>
+            <w:webHidden/>
+          </w:rPr>
+          <w:tab/>
+        </w:r>
+        <w:r>
+          <w:rPr>
+            <w:noProof/>
+            <w:webHidden/>
+          </w:rPr>
+          <w:fldChar w:fldCharType="begin"/>
+        </w:r>
+        <w:r>
+          <w:rPr>
+            <w:noProof/>
+            <w:webHidden/>
+          </w:rPr>
+          <w:instrText xml:space="preserve"> PAGEREF _Toc239415452 \h </w:instrText>
+        </w:r>
+        <w:r>
+          <w:rPr>
+            <w:noProof/>
+            <w:webHidden/>
+          </w:rPr>
+        </w:r>
+        <w:r>
+          <w:rPr>
+            <w:noProof/>
+            <w:webHidden/>
+          </w:rPr>
+          <w:fldChar w:fldCharType="separate"/>
+        </w:r>
+        <w:r>
+          <w:rPr>
+            <w:noProof/>
+            <w:webHidden/>
+          </w:rPr>
+          <w:t>10</w:t>
+        </w:r>
+        <w:r>
+          <w:rPr>
+            <w:noProof/>
+            <w:webHidden/>
+          </w:rPr>
+          <w:fldChar w:fldCharType="end"/>
+        </w:r>
+      </w:hyperlink>
+    </w:p>
+    <w:p>
+      <w:pPr>
+        <w:pStyle w:val="TableofFigures"/>
+        <w:tabs>
+          <w:tab w:val="right" w:leader="dot" w:pos="9350"/>
+        </w:tabs>
+        <w:rPr>
+          <w:noProof/>
+          <w:kern w:val="2"/>
+          <w:sz w:val="24"/>
+          <w:szCs w:val="24"/>
+          <w14:ligatures w14:val="standardContextual"/>
+        </w:rPr>
+      </w:pPr>
+      <w:hyperlink w:anchor="_Toc239415453" w:history="1">
+        <w:r>
+          <w:rPr>
+            <w:rStyle w:val="Hyperlink"/>
+            <w:noProof/>
+          </w:rPr>
+          <w:t>Figure 4 Libraries of OMEdit</w:t>
+        </w:r>
+        <w:r>
+          <w:rPr>
+            <w:noProof/>
+            <w:webHidden/>
+          </w:rPr>
+          <w:tab/>
+        </w:r>
+        <w:r>
+          <w:rPr>
+            <w:noProof/>
+            <w:webHidden/>
+          </w:rPr>
+          <w:fldChar w:fldCharType="begin"/>
+        </w:r>
+        <w:r>
+          <w:rPr>
+            <w:noProof/>
+            <w:webHidden/>
+          </w:rPr>
+          <w:instrText xml:space="preserve"> PAGEREF _Toc239415453 \h </w:instrText>
+        </w:r>
+        <w:r>
+          <w:rPr>
+            <w:noProof/>
+            <w:webHidden/>
+          </w:rPr>
+        </w:r>
+        <w:r>
+          <w:rPr>
+            <w:noProof/>
+            <w:webHidden/>
+          </w:rPr>
+          <w:fldChar w:fldCharType="separate"/>
+        </w:r>
+        <w:r>
+          <w:rPr>
+            <w:noProof/>
+            <w:webHidden/>
+          </w:rPr>
+          <w:t>10</w:t>
+        </w:r>
+        <w:r>
+          <w:rPr>
+            <w:noProof/>
+            <w:webHidden/>
+          </w:rPr>
+          <w:fldChar w:fldCharType="end"/>
+        </w:r>
+      </w:hyperlink>
+    </w:p>
+    <w:p>
+      <w:pPr>
+        <w:pStyle w:val="TableofFigures"/>
+        <w:tabs>
+          <w:tab w:val="right" w:leader="dot" w:pos="9350"/>
+        </w:tabs>
+        <w:rPr>
+          <w:noProof/>
+          <w:kern w:val="2"/>
+          <w:sz w:val="24"/>
+          <w:szCs w:val="24"/>
+          <w14:ligatures w14:val="standardContextual"/>
+        </w:rPr>
+      </w:pPr>
+      <w:hyperlink w:anchor="_Toc239415454" w:history="1">
+        <w:r>
+          <w:rPr>
+            <w:rStyle w:val="Hyperlink"/>
+            <w:noProof/>
+          </w:rPr>
+          <w:t>Figure 5 Extended View of Libraries of OMEdit</w:t>
+        </w:r>
+        <w:r>
+          <w:rPr>
+            <w:noProof/>
+            <w:webHidden/>
+          </w:rPr>
+          <w:tab/>
+        </w:r>
+        <w:r>
+          <w:rPr>
+            <w:noProof/>
+            <w:webHidden/>
+          </w:rPr>
+          <w:fldChar w:fldCharType="begin"/>
+        </w:r>
+        <w:r>
+          <w:rPr>
+            <w:noProof/>
+            <w:webHidden/>
+          </w:rPr>
+          <w:instrText xml:space="preserve"> PAGEREF _Toc239415454 \h </w:instrText>
+        </w:r>
+        <w:r>
+          <w:rPr>
+            <w:noProof/>
+            <w:webHidden/>
+          </w:rPr>
+        </w:r>
+        <w:r>
+          <w:rPr>
+            <w:noProof/>
+            <w:webHidden/>
+          </w:rPr>
+          <w:fldChar w:fldCharType="separate"/>
+        </w:r>
+        <w:r>
+          <w:rPr>
+            <w:noProof/>
+            <w:webHidden/>
+          </w:rPr>
+          <w:t>11</w:t>
+        </w:r>
+        <w:r>
+          <w:rPr>
+            <w:noProof/>
+            <w:webHidden/>
+          </w:rPr>
+          <w:fldChar w:fldCharType="end"/>
+        </w:r>
+      </w:hyperlink>
+    </w:p>
+    <w:p>
+      <w:pPr>
+        <w:pStyle w:val="TableofFigures"/>
+        <w:tabs>
+          <w:tab w:val="right" w:leader="dot" w:pos="9350"/>
+        </w:tabs>
+        <w:rPr>
+          <w:noProof/>
+          <w:kern w:val="2"/>
+          <w:sz w:val="24"/>
+          <w:szCs w:val="24"/>
+          <w14:ligatures w14:val="standardContextual"/>
+        </w:rPr>
+      </w:pPr>
+      <w:hyperlink w:anchor="_Toc239415455" w:history="1">
+        <w:r>
+          <w:rPr>
+            <w:rStyle w:val="Hyperlink"/>
+            <w:noProof/>
+          </w:rPr>
+          <w:t>Figure 6 Diagram View</w:t>
+        </w:r>
+        <w:r>
+          <w:rPr>
+            <w:noProof/>
+            <w:webHidden/>
+          </w:rPr>
+          <w:tab/>
+        </w:r>
+        <w:r>
+          <w:rPr>
+            <w:noProof/>
+            <w:webHidden/>
+          </w:rPr>
+          <w:fldChar w:fldCharType="begin"/>
+        </w:r>
+        <w:r>
+          <w:rPr>
+            <w:noProof/>
+            <w:webHidden/>
+          </w:rPr>
+          <w:instrText xml:space="preserve"> PAGEREF _Toc239415455 \h </w:instrText>
+        </w:r>
+        <w:r>
+          <w:rPr>
+            <w:noProof/>
+            <w:webHidden/>
+          </w:rPr>
+        </w:r>
+        <w:r>
+          <w:rPr>
+            <w:noProof/>
+            <w:webHidden/>
+          </w:rPr>
+          <w:fldChar w:fldCharType="separate"/>
+        </w:r>
+        <w:r>
+          <w:rPr>
+            <w:noProof/>
+            <w:webHidden/>
+          </w:rPr>
+          <w:t>12</w:t>
+        </w:r>
+        <w:r>
+          <w:rPr>
+            <w:noProof/>
+            <w:webHidden/>
+          </w:rPr>
+          <w:fldChar w:fldCharType="end"/>
+        </w:r>
+      </w:hyperlink>
+    </w:p>
+    <w:p>
+      <w:pPr>
+        <w:pStyle w:val="TableofFigures"/>
+        <w:tabs>
+          <w:tab w:val="right" w:leader="dot" w:pos="9350"/>
+        </w:tabs>
+        <w:rPr>
+          <w:noProof/>
+          <w:kern w:val="2"/>
+          <w:sz w:val="24"/>
+          <w:szCs w:val="24"/>
+          <w14:ligatures w14:val="standardContextual"/>
+        </w:rPr>
+      </w:pPr>
+      <w:hyperlink w:anchor="_Toc239415456" w:history="1">
+        <w:r>
+          <w:rPr>
+            <w:rStyle w:val="Hyperlink"/>
+            <w:noProof/>
+          </w:rPr>
+          <w:t>Figure 7 Message Logs</w:t>
+        </w:r>
+        <w:r>
+          <w:rPr>
+            <w:noProof/>
+            <w:webHidden/>
+          </w:rPr>
+          <w:tab/>
+        </w:r>
+        <w:r>
+          <w:rPr>
+            <w:noProof/>
+            <w:webHidden/>
+          </w:rPr>
+          <w:fldChar w:fldCharType="begin"/>
+        </w:r>
+        <w:r>
+          <w:rPr>
+            <w:noProof/>
+            <w:webHidden/>
+          </w:rPr>
+          <w:instrText xml:space="preserve"> PAGEREF _Toc239415456 \h </w:instrText>
+        </w:r>
+        <w:r>
+          <w:rPr>
+            <w:noProof/>
+            <w:webHidden/>
+          </w:rPr>
+        </w:r>
+        <w:r>
+          <w:rPr>
+            <w:noProof/>
+            <w:webHidden/>
+          </w:rPr>
+          <w:fldChar w:fldCharType="separate"/>
+        </w:r>
+        <w:r>
+          <w:rPr>
+            <w:noProof/>
+            <w:webHidden/>
+          </w:rPr>
+          <w:t>12</w:t>
+        </w:r>
+        <w:r>
+          <w:rPr>
+            <w:noProof/>
+            <w:webHidden/>
+          </w:rPr>
+          <w:fldChar w:fldCharType="end"/>
+        </w:r>
+      </w:hyperlink>
+    </w:p>
+    <w:p>
+      <w:pPr>
+        <w:pStyle w:val="TableofFigures"/>
+        <w:tabs>
+          <w:tab w:val="right" w:leader="dot" w:pos="9350"/>
+        </w:tabs>
+        <w:rPr>
+          <w:noProof/>
+          <w:kern w:val="2"/>
+          <w:sz w:val="24"/>
+          <w:szCs w:val="24"/>
+          <w14:ligatures w14:val="standardContextual"/>
+        </w:rPr>
+      </w:pPr>
+      <w:hyperlink w:anchor="_Toc239415457" w:history="1">
+        <w:r>
+          <w:rPr>
+            <w:rStyle w:val="Hyperlink"/>
+            <w:noProof/>
+          </w:rPr>
+          <w:t>Figure 8 Canvas View of New Model</w:t>
+        </w:r>
+        <w:r>
+          <w:rPr>
+            <w:noProof/>
+            <w:webHidden/>
+          </w:rPr>
+          <w:tab/>
+        </w:r>
+        <w:r>
+          <w:rPr>
+            <w:noProof/>
+            <w:webHidden/>
+          </w:rPr>
+          <w:fldChar w:fldCharType="begin"/>
+        </w:r>
+        <w:r>
+          <w:rPr>
+            <w:noProof/>
+            <w:webHidden/>
+          </w:rPr>
+          <w:instrText xml:space="preserve"> PAGEREF _Toc239415457 \h </w:instrText>
+        </w:r>
+        <w:r>
+          <w:rPr>
+            <w:noProof/>
+            <w:webHidden/>
+          </w:rPr>
+        </w:r>
+        <w:r>
+          <w:rPr>
+            <w:noProof/>
+            <w:webHidden/>
+          </w:rPr>
+          <w:fldChar w:fldCharType="separate"/>
+        </w:r>
+        <w:r>
+          <w:rPr>
+            <w:noProof/>
+            <w:webHidden/>
+          </w:rPr>
+          <w:t>14</w:t>
+        </w:r>
+        <w:r>
+          <w:rPr>
+            <w:noProof/>
+            <w:webHidden/>
+          </w:rPr>
+          <w:fldChar w:fldCharType="end"/>
+        </w:r>
+      </w:hyperlink>
+    </w:p>
+    <w:p>
+      <w:pPr>
+        <w:pStyle w:val="TableofFigures"/>
+        <w:tabs>
+          <w:tab w:val="right" w:leader="dot" w:pos="9350"/>
+        </w:tabs>
+        <w:rPr>
+          <w:noProof/>
+          <w:kern w:val="2"/>
+          <w:sz w:val="24"/>
+          <w:szCs w:val="24"/>
+          <w14:ligatures w14:val="standardContextual"/>
+        </w:rPr>
+      </w:pPr>
+      <w:hyperlink w:anchor="_Toc239415458" w:history="1">
+        <w:r>
+          <w:rPr>
+            <w:rStyle w:val="Hyperlink"/>
+            <w:noProof/>
+          </w:rPr>
+          <w:t>Figure 9 Text View of the New Model</w:t>
+        </w:r>
+        <w:r>
+          <w:rPr>
+            <w:noProof/>
+            <w:webHidden/>
+          </w:rPr>
+          <w:tab/>
+        </w:r>
+        <w:r>
+          <w:rPr>
+            <w:noProof/>
+            <w:webHidden/>
+          </w:rPr>
+          <w:fldChar w:fldCharType="begin"/>
+        </w:r>
+        <w:r>
+          <w:rPr>
+            <w:noProof/>
+            <w:webHidden/>
+          </w:rPr>
+          <w:instrText xml:space="preserve"> PAGEREF _Toc239415458 \h </w:instrText>
+        </w:r>
+        <w:r>
+          <w:rPr>
+            <w:noProof/>
+            <w:webHidden/>
+          </w:rPr>
+        </w:r>
+        <w:r>
+          <w:rPr>
+            <w:noProof/>
+            <w:webHidden/>
+          </w:rPr>
+          <w:fldChar w:fldCharType="separate"/>
+        </w:r>
+        <w:r>
+          <w:rPr>
+            <w:noProof/>
+            <w:webHidden/>
+          </w:rPr>
+          <w:t>15</w:t>
+        </w:r>
+        <w:r>
+          <w:rPr>
+            <w:noProof/>
+            <w:webHidden/>
+          </w:rPr>
+          <w:fldChar w:fldCharType="end"/>
+        </w:r>
+      </w:hyperlink>
+    </w:p>
+    <w:p>
+      <w:pPr>
+        <w:pStyle w:val="TableofFigures"/>
+        <w:tabs>
+          <w:tab w:val="right" w:leader="dot" w:pos="9350"/>
+        </w:tabs>
+        <w:rPr>
+          <w:noProof/>
+          <w:kern w:val="2"/>
+          <w:sz w:val="24"/>
+          <w:szCs w:val="24"/>
+          <w14:ligatures w14:val="standardContextual"/>
+        </w:rPr>
+      </w:pPr>
+      <w:hyperlink w:anchor="_Toc239415459" w:history="1">
+        <w:r>
+          <w:rPr>
+            <w:rStyle w:val="Hyperlink"/>
+            <w:noProof/>
+          </w:rPr>
+          <w:t>Figure 10 Model Checks</w:t>
+        </w:r>
+        <w:r>
+          <w:rPr>
+            <w:noProof/>
+            <w:webHidden/>
+          </w:rPr>
+          <w:tab/>
+        </w:r>
+        <w:r>
+          <w:rPr>
+            <w:noProof/>
+            <w:webHidden/>
+          </w:rPr>
+          <w:fldChar w:fldCharType="begin"/>
+        </w:r>
+        <w:r>
+          <w:rPr>
+            <w:noProof/>
+            <w:webHidden/>
+          </w:rPr>
+          <w:instrText xml:space="preserve"> PAGEREF _Toc239415459 \h </w:instrText>
+        </w:r>
+        <w:r>
+          <w:rPr>
+            <w:noProof/>
+            <w:webHidden/>
+          </w:rPr>
+        </w:r>
+        <w:r>
+          <w:rPr>
+            <w:noProof/>
+            <w:webHidden/>
+          </w:rPr>
+          <w:fldChar w:fldCharType="separate"/>
+        </w:r>
+        <w:r>
+          <w:rPr>
+            <w:noProof/>
+            <w:webHidden/>
+          </w:rPr>
+          <w:t>17</w:t>
+        </w:r>
+        <w:r>
+          <w:rPr>
+            <w:noProof/>
+            <w:webHidden/>
+          </w:rPr>
+          <w:fldChar w:fldCharType="end"/>
+        </w:r>
+      </w:hyperlink>
+    </w:p>
+    <w:p>
+      <w:pPr>
+        <w:pStyle w:val="TableofFigures"/>
+        <w:tabs>
+          <w:tab w:val="right" w:leader="dot" w:pos="9350"/>
+        </w:tabs>
+        <w:rPr>
+          <w:noProof/>
+          <w:kern w:val="2"/>
+          <w:sz w:val="24"/>
+          <w:szCs w:val="24"/>
+          <w14:ligatures w14:val="standardContextual"/>
+        </w:rPr>
+      </w:pPr>
+      <w:hyperlink w:anchor="_Toc239415460" w:history="1">
+        <w:r>
+          <w:rPr>
+            <w:rStyle w:val="Hyperlink"/>
+            <w:noProof/>
+          </w:rPr>
+          <w:t>Figure 11 Logs Checks</w:t>
+        </w:r>
+        <w:r>
+          <w:rPr>
+            <w:noProof/>
+            <w:webHidden/>
+          </w:rPr>
+          <w:tab/>
+        </w:r>
+        <w:r>
+          <w:rPr>
+            <w:noProof/>
+            <w:webHidden/>
+          </w:rPr>
+          <w:fldChar w:fldCharType="begin"/>
+        </w:r>
+        <w:r>
+          <w:rPr>
+            <w:noProof/>
+            <w:webHidden/>
+          </w:rPr>
+          <w:instrText xml:space="preserve"> PAGEREF _Toc239415460 \h </w:instrText>
+        </w:r>
+        <w:r>
+          <w:rPr>
+            <w:noProof/>
+            <w:webHidden/>
+          </w:rPr>
+        </w:r>
+        <w:r>
+          <w:rPr>
+            <w:noProof/>
+            <w:webHidden/>
+          </w:rPr>
+          <w:fldChar w:fldCharType="separate"/>
+        </w:r>
+        <w:r>
+          <w:rPr>
+            <w:noProof/>
+            <w:webHidden/>
+          </w:rPr>
+          <w:t>17</w:t>
+        </w:r>
+        <w:r>
+          <w:rPr>
+            <w:noProof/>
+            <w:webHidden/>
+          </w:rPr>
+          <w:fldChar w:fldCharType="end"/>
+        </w:r>
+      </w:hyperlink>
+    </w:p>
+    <w:p>
+      <w:pPr>
+        <w:pStyle w:val="TableofFigures"/>
+        <w:tabs>
+          <w:tab w:val="right" w:leader="dot" w:pos="9350"/>
+        </w:tabs>
+        <w:rPr>
+          <w:noProof/>
+          <w:kern w:val="2"/>
+          <w:sz w:val="24"/>
+          <w:szCs w:val="24"/>
+          <w14:ligatures w14:val="standardContextual"/>
+        </w:rPr>
+      </w:pPr>
+      <w:hyperlink w:anchor="_Toc239415461" w:history="1">
+        <w:r>
+          <w:rPr>
+            <w:rStyle w:val="Hyperlink"/>
+            <w:noProof/>
+          </w:rPr>
+          <w:t>Figure 12 Simulate</w:t>
+        </w:r>
+        <w:r>
+          <w:rPr>
+            <w:noProof/>
+            <w:webHidden/>
+          </w:rPr>
+          <w:tab/>
+        </w:r>
+        <w:r>
+          <w:rPr>
+            <w:noProof/>
+            <w:webHidden/>
+          </w:rPr>
+          <w:fldChar w:fldCharType="begin"/>
+        </w:r>
+        <w:r>
+          <w:rPr>
+            <w:noProof/>
+            <w:webHidden/>
+          </w:rPr>
+          <w:instrText xml:space="preserve"> PAGEREF _Toc239415461 \h </w:instrText>
+        </w:r>
+        <w:r>
+          <w:rPr>
+            <w:noProof/>
+            <w:webHidden/>
+          </w:rPr>
+        </w:r>
+        <w:r>
+          <w:rPr>
+            <w:noProof/>
+            <w:webHidden/>
+          </w:rPr>
+          <w:fldChar w:fldCharType="separate"/>
+        </w:r>
+        <w:r>
+          <w:rPr>
+            <w:noProof/>
+            <w:webHidden/>
+          </w:rPr>
+          <w:t>17</w:t>
+        </w:r>
+        <w:r>
+          <w:rPr>
+            <w:noProof/>
+            <w:webHidden/>
+          </w:rPr>
+          <w:fldChar w:fldCharType="end"/>
+        </w:r>
+      </w:hyperlink>
+    </w:p>
+    <w:p>
+      <w:pPr>
+        <w:pStyle w:val="TableofFigures"/>
+        <w:tabs>
+          <w:tab w:val="right" w:leader="dot" w:pos="9350"/>
+        </w:tabs>
+        <w:rPr>
+          <w:noProof/>
+          <w:kern w:val="2"/>
+          <w:sz w:val="24"/>
+          <w:szCs w:val="24"/>
+          <w14:ligatures w14:val="standardContextual"/>
+        </w:rPr>
+      </w:pPr>
+      <w:hyperlink w:anchor="_Toc239415462" w:history="1">
+        <w:r>
+          <w:rPr>
+            <w:rStyle w:val="Hyperlink"/>
+            <w:noProof/>
+          </w:rPr>
+          <w:t>Figure 13 Simulation Setup</w:t>
+        </w:r>
+        <w:r>
+          <w:rPr>
+            <w:noProof/>
+            <w:webHidden/>
+          </w:rPr>
+          <w:tab/>
+        </w:r>
+        <w:r>
+          <w:rPr>
+            <w:noProof/>
+            <w:webHidden/>
+          </w:rPr>
+          <w:fldChar w:fldCharType="begin"/>
+        </w:r>
+        <w:r>
+          <w:rPr>
+            <w:noProof/>
+            <w:webHidden/>
+          </w:rPr>
+          <w:instrText xml:space="preserve"> PAGEREF _Toc239415462 \h </w:instrText>
+        </w:r>
+        <w:r>
+          <w:rPr>
+            <w:noProof/>
+            <w:webHidden/>
+          </w:rPr>
+        </w:r>
+        <w:r>
+          <w:rPr>
+            <w:noProof/>
+            <w:webHidden/>
+          </w:rPr>
+          <w:fldChar w:fldCharType="separate"/>
+        </w:r>
+        <w:r>
+          <w:rPr>
+            <w:noProof/>
+            <w:webHidden/>
+          </w:rPr>
+          <w:t>18</w:t>
+        </w:r>
+        <w:r>
+          <w:rPr>
+            <w:noProof/>
+            <w:webHidden/>
+          </w:rPr>
+          <w:fldChar w:fldCharType="end"/>
+        </w:r>
+      </w:hyperlink>
+    </w:p>
+    <w:p>
+      <w:pPr>
+        <w:pStyle w:val="TableofFigures"/>
+        <w:tabs>
+          <w:tab w:val="right" w:leader="dot" w:pos="9350"/>
+        </w:tabs>
+        <w:rPr>
+          <w:noProof/>
+          <w:kern w:val="2"/>
+          <w:sz w:val="24"/>
+          <w:szCs w:val="24"/>
+          <w14:ligatures w14:val="standardContextual"/>
+        </w:rPr>
+      </w:pPr>
+      <w:hyperlink w:anchor="_Toc239415463" w:history="1">
+        <w:r>
+          <w:rPr>
+            <w:rStyle w:val="Hyperlink"/>
+            <w:noProof/>
+          </w:rPr>
+          <w:t>Figure 14 Plots</w:t>
+        </w:r>
+        <w:r>
+          <w:rPr>
+            <w:noProof/>
+            <w:webHidden/>
+          </w:rPr>
+          <w:tab/>
+        </w:r>
+        <w:r>
+          <w:rPr>
+            <w:noProof/>
+            <w:webHidden/>
+          </w:rPr>
+          <w:fldChar w:fldCharType="begin"/>
+        </w:r>
+        <w:r>
+          <w:rPr>
+            <w:noProof/>
+            <w:webHidden/>
+          </w:rPr>
+          <w:instrText xml:space="preserve"> PAGEREF _Toc239415463 \h </w:instrText>
+        </w:r>
+        <w:r>
+          <w:rPr>
+            <w:noProof/>
+            <w:webHidden/>
+          </w:rPr>
+        </w:r>
+        <w:r>
+          <w:rPr>
+            <w:noProof/>
+            <w:webHidden/>
+          </w:rPr>
+          <w:fldChar w:fldCharType="separate"/>
+        </w:r>
+        <w:r>
+          <w:rPr>
+            <w:noProof/>
+            <w:webHidden/>
+          </w:rPr>
+          <w:t>19</w:t>
+        </w:r>
+        <w:r>
+          <w:rPr>
+            <w:noProof/>
+            <w:webHidden/>
+          </w:rPr>
+          <w:fldChar w:fldCharType="end"/>
+        </w:r>
+      </w:hyperlink>
+    </w:p>
+    <w:p>
+      <w:pPr>
+        <w:pStyle w:val="TableofFigures"/>
+        <w:tabs>
+          <w:tab w:val="right" w:leader="dot" w:pos="9350"/>
+        </w:tabs>
+        <w:rPr>
+          <w:noProof/>
+          <w:kern w:val="2"/>
+          <w:sz w:val="24"/>
+          <w:szCs w:val="24"/>
+          <w14:ligatures w14:val="standardContextual"/>
+        </w:rPr>
+      </w:pPr>
+      <w:hyperlink w:anchor="_Toc239415464" w:history="1">
+        <w:r>
+          <w:rPr>
+            <w:rStyle w:val="Hyperlink"/>
+            <w:noProof/>
+          </w:rPr>
+          <w:t>Figure 15 Output File</w:t>
+        </w:r>
+        <w:r>
+          <w:rPr>
+            <w:noProof/>
+            <w:webHidden/>
+          </w:rPr>
+          <w:tab/>
+        </w:r>
+        <w:r>
+          <w:rPr>
+            <w:noProof/>
+            <w:webHidden/>
+          </w:rPr>
+          <w:fldChar w:fldCharType="begin"/>
+        </w:r>
+        <w:r>
+          <w:rPr>
+            <w:noProof/>
+            <w:webHidden/>
+          </w:rPr>
+          <w:instrText xml:space="preserve"> PAGEREF _Toc239415464 \h </w:instrText>
+        </w:r>
+        <w:r>
+          <w:rPr>
+            <w:noProof/>
+            <w:webHidden/>
+          </w:rPr>
+        </w:r>
+        <w:r>
+          <w:rPr>
+            <w:noProof/>
+            <w:webHidden/>
+          </w:rPr>
+          <w:fldChar w:fldCharType="separate"/>
+        </w:r>
+        <w:r>
+          <w:rPr>
+            <w:noProof/>
+            <w:webHidden/>
+          </w:rPr>
+          <w:t>20</w:t>
+        </w:r>
+        <w:r>
+          <w:rPr>
+            <w:noProof/>
+            <w:webHidden/>
+          </w:rPr>
+          <w:fldChar w:fldCharType="end"/>
+        </w:r>
+      </w:hyperlink>
+    </w:p>
+    <w:p>
+      <w:pPr>
+        <w:pStyle w:val="TableofFigures"/>
+        <w:tabs>
+          <w:tab w:val="right" w:leader="dot" w:pos="9350"/>
+        </w:tabs>
+        <w:rPr>
+          <w:noProof/>
+          <w:kern w:val="2"/>
+          <w:sz w:val="24"/>
+          <w:szCs w:val="24"/>
+          <w14:ligatures w14:val="standardContextual"/>
+        </w:rPr>
+      </w:pPr>
+      <w:hyperlink w:anchor="_Toc239415465" w:history="1">
+        <w:r>
+          <w:rPr>
+            <w:rStyle w:val="Hyperlink"/>
+            <w:noProof/>
+          </w:rPr>
+          <w:t>Figure 16 Plots Display</w:t>
+        </w:r>
+        <w:r>
+          <w:rPr>
+            <w:noProof/>
+            <w:webHidden/>
+          </w:rPr>
+          <w:tab/>
+        </w:r>
+        <w:r>
+          <w:rPr>
+            <w:noProof/>
+            <w:webHidden/>
+          </w:rPr>
+          <w:fldChar w:fldCharType="begin"/>
+        </w:r>
+        <w:r>
+          <w:rPr>
+            <w:noProof/>
+            <w:webHidden/>
+          </w:rPr>
+          <w:instrText xml:space="preserve"> PAGEREF _Toc239415465 \h </w:instrText>
+        </w:r>
+        <w:r>
+          <w:rPr>
+            <w:noProof/>
+            <w:webHidden/>
+          </w:rPr>
+        </w:r>
+        <w:r>
+          <w:rPr>
+            <w:noProof/>
+            <w:webHidden/>
+          </w:rPr>
+          <w:fldChar w:fldCharType="separate"/>
+        </w:r>
+        <w:r>
+          <w:rPr>
+            <w:noProof/>
+            <w:webHidden/>
+          </w:rPr>
+          <w:t>21</w:t>
+        </w:r>
+        <w:r>
+          <w:rPr>
+            <w:noProof/>
+            <w:webHidden/>
+          </w:rPr>
+          <w:fldChar w:fldCharType="end"/>
+        </w:r>
+      </w:hyperlink>
+    </w:p>
+    <w:p>
+      <w:pPr>
+        <w:pStyle w:val="TableofFigures"/>
+        <w:tabs>
+          <w:tab w:val="right" w:leader="dot" w:pos="9350"/>
+        </w:tabs>
+        <w:rPr>
+          <w:noProof/>
+          <w:kern w:val="2"/>
+          <w:sz w:val="24"/>
+          <w:szCs w:val="24"/>
+          <w14:ligatures w14:val="standardContextual"/>
+        </w:rPr>
+      </w:pPr>
+      <w:hyperlink w:anchor="_Toc239415466" w:history="1">
+        <w:r>
+          <w:rPr>
+            <w:rStyle w:val="Hyperlink"/>
+            <w:noProof/>
+          </w:rPr>
+          <w:t>Figure 17 Tool Ribbon to export results as CSV</w:t>
+        </w:r>
+        <w:r>
+          <w:rPr>
+            <w:noProof/>
+            <w:webHidden/>
+          </w:rPr>
+          <w:tab/>
+        </w:r>
+        <w:r>
+          <w:rPr>
+            <w:noProof/>
+            <w:webHidden/>
+          </w:rPr>
+          <w:fldChar w:fldCharType="begin"/>
+        </w:r>
+        <w:r>
+          <w:rPr>
+            <w:noProof/>
+            <w:webHidden/>
+          </w:rPr>
+          <w:instrText xml:space="preserve"> PAGEREF _Toc239415466 \h </w:instrText>
+        </w:r>
+        <w:r>
+          <w:rPr>
+            <w:noProof/>
+            <w:webHidden/>
+          </w:rPr>
+        </w:r>
+        <w:r>
+          <w:rPr>
+            <w:noProof/>
+            <w:webHidden/>
+          </w:rPr>
+          <w:fldChar w:fldCharType="separate"/>
+        </w:r>
+        <w:r>
+          <w:rPr>
+            <w:noProof/>
+            <w:webHidden/>
+          </w:rPr>
+          <w:t>21</w:t>
+        </w:r>
+        <w:r>
+          <w:rPr>
+            <w:noProof/>
+            <w:webHidden/>
+          </w:rPr>
+          <w:fldChar w:fldCharType="end"/>
+        </w:r>
+      </w:hyperlink>
+    </w:p>
+    <w:p>
       <w:r>
         <w:fldChar w:fldCharType="end"/>
       </w:r>
@@ -3666,121 +4818,106 @@
       </w:r>
     </w:p>
     <w:p>
-      <w:r>
-        <w:fldChar w:fldCharType="begin"/>
-      </w:r>
-      <w:r>
-        <w:instrText xml:space="preserve"> TOC \h \z \c "Table" </w:instrText>
-      </w:r>
-      <w:r>
-        <w:fldChar w:fldCharType="separate"/>
-      </w:r>
+      <w:fldSimple w:instr=" TOC \h \z \c &quot;Table&quot; ">
+        <w:r>
+          <w:rPr>
+            <w:b/>
+            <w:bCs/>
+            <w:noProof/>
+          </w:rPr>
+          <w:t>No table of figures entries found.</w:t>
+        </w:r>
+      </w:fldSimple>
+    </w:p>
+    <w:p>
+      <w:r>
+        <w:br w:type="page"/>
+      </w:r>
+    </w:p>
+    <w:p>
+      <w:pPr>
+        <w:pStyle w:val="Heading1"/>
+      </w:pPr>
+      <w:bookmarkStart w:id="0" w:name="_Toc239415423"/>
+      <w:r>
+        <w:lastRenderedPageBreak/>
+        <w:t xml:space="preserve">What is </w:t>
+      </w:r>
+      <w:proofErr w:type="spellStart"/>
+      <w:r>
+        <w:t>OpenModellica</w:t>
+      </w:r>
+      <w:proofErr w:type="spellEnd"/>
+      <w:r>
+        <w:t>?</w:t>
+      </w:r>
+      <w:bookmarkEnd w:id="0"/>
+    </w:p>
+    <w:p>
+      <w:r>
+        <w:t>Welcome to the world of digital process simulation. If you are a process engineer, you are likely familiar with the challenges of designing, optimizing, and troubleshooting complex systems whether they involve heat exchangers, distillation columns, or entire power plants. You need tools that can handle math without getting in the way of engineering.</w:t>
+      </w:r>
+    </w:p>
+    <w:p>
+      <w:r>
+        <w:t xml:space="preserve">This is where </w:t>
+      </w:r>
+      <w:proofErr w:type="spellStart"/>
       <w:r>
         <w:rPr>
           <w:b/>
           <w:bCs/>
-          <w:noProof/>
-        </w:rPr>
-        <w:t>No table of figures entries found.</w:t>
+        </w:rPr>
+        <w:t>OpenModelica</w:t>
+      </w:r>
+      <w:proofErr w:type="spellEnd"/>
+      <w:r>
+        <w:t xml:space="preserve"> comes in.</w:t>
+      </w:r>
+    </w:p>
+    <w:p>
+      <w:pPr>
+        <w:pStyle w:val="Heading2"/>
+      </w:pPr>
+      <w:bookmarkStart w:id="1" w:name="_Toc239415424"/>
+      <w:r>
+        <w:t>The Short Definition</w:t>
+      </w:r>
+      <w:bookmarkEnd w:id="1"/>
+    </w:p>
+    <w:p>
+      <w:proofErr w:type="spellStart"/>
+      <w:r>
+        <w:t>OpenModelica</w:t>
+      </w:r>
+      <w:proofErr w:type="spellEnd"/>
+      <w:r>
+        <w:t xml:space="preserve"> is a </w:t>
       </w:r>
       <w:r>
         <w:rPr>
           <w:b/>
           <w:bCs/>
-          <w:noProof/>
-        </w:rPr>
-        <w:fldChar w:fldCharType="end"/>
-      </w:r>
-    </w:p>
-    <w:p>
-      <w:r>
-        <w:br w:type="page"/>
-      </w:r>
-    </w:p>
-    <w:p>
-      <w:pPr>
-        <w:pStyle w:val="Heading1"/>
-      </w:pPr>
-      <w:bookmarkStart w:id="0" w:name="_Toc239257586"/>
-      <w:r>
-        <w:lastRenderedPageBreak/>
-        <w:t xml:space="preserve">What is </w:t>
+        </w:rPr>
+        <w:t>free, open-source environment</w:t>
+      </w:r>
+      <w:r>
+        <w:t xml:space="preserve"> designed for modeling, simulating, and optimizing complex dynamic systems. Think of it as a highly capable "virtual test lab" for your processes. Unlike some commercial software that feels like a "black box," </w:t>
       </w:r>
       <w:proofErr w:type="spellStart"/>
       <w:r>
-        <w:t>OpenModellica</w:t>
+        <w:t>OpenModelica</w:t>
       </w:r>
       <w:proofErr w:type="spellEnd"/>
       <w:r>
-        <w:t>?</w:t>
-      </w:r>
-      <w:bookmarkEnd w:id="0"/>
-    </w:p>
-    <w:p>
-      <w:r>
-        <w:t>Welcome to the world of digital process simulation. If you are a process engineer, you are likely familiar with the challenges of designing, optimizing, and troubleshooting complex systems whether they involve heat exchangers, distillation columns, or entire power plants. You need tools that can handle math without getting in the way of engineering.</w:t>
-      </w:r>
-    </w:p>
-    <w:p>
-      <w:r>
-        <w:t xml:space="preserve">This is where </w:t>
-      </w:r>
-      <w:proofErr w:type="spellStart"/>
-      <w:r>
-        <w:rPr>
-          <w:b/>
-          <w:bCs/>
-        </w:rPr>
-        <w:t>OpenModelica</w:t>
-      </w:r>
-      <w:proofErr w:type="spellEnd"/>
-      <w:r>
-        <w:t xml:space="preserve"> comes in.</w:t>
+        <w:t xml:space="preserve"> is transparent and highly customizable, making it an excellent choice for engineers who want to understand the underlying physics and mathematics of their processes.</w:t>
       </w:r>
     </w:p>
     <w:p>
       <w:pPr>
         <w:pStyle w:val="Heading2"/>
       </w:pPr>
-      <w:bookmarkStart w:id="1" w:name="_Toc239257587"/>
-      <w:r>
-        <w:t>The Short Definition</w:t>
-      </w:r>
-      <w:bookmarkEnd w:id="1"/>
-    </w:p>
-    <w:p>
-      <w:proofErr w:type="spellStart"/>
-      <w:r>
-        <w:t>OpenModelica</w:t>
-      </w:r>
-      <w:proofErr w:type="spellEnd"/>
-      <w:r>
-        <w:t xml:space="preserve"> is a </w:t>
-      </w:r>
-      <w:r>
-        <w:rPr>
-          <w:b/>
-          <w:bCs/>
-        </w:rPr>
-        <w:t>free, open-source environment</w:t>
-      </w:r>
-      <w:r>
-        <w:t xml:space="preserve"> designed for modeling, simulating, and optimizing complex dynamic systems. Think of it as a highly capable "virtual test lab" for your processes. Unlike some commercial software that feels like a "black box," </w:t>
-      </w:r>
-      <w:proofErr w:type="spellStart"/>
-      <w:r>
-        <w:t>OpenModelica</w:t>
-      </w:r>
-      <w:proofErr w:type="spellEnd"/>
-      <w:r>
-        <w:t xml:space="preserve"> is transparent and highly customizable, making it an excellent choice for engineers who want to understand the underlying physics and mathematics of their processes.</w:t>
-      </w:r>
-    </w:p>
-    <w:p>
-      <w:pPr>
-        <w:pStyle w:val="Heading2"/>
-      </w:pPr>
-      <w:bookmarkStart w:id="2" w:name="_Toc239257588"/>
+      <w:bookmarkStart w:id="2" w:name="_Toc239415425"/>
       <w:r>
         <w:t>Why Should a Process Engineer Care?</w:t>
       </w:r>
@@ -3950,7 +5087,7 @@
       <w:pPr>
         <w:pStyle w:val="Heading2"/>
       </w:pPr>
-      <w:bookmarkStart w:id="3" w:name="_Toc239257589"/>
+      <w:bookmarkStart w:id="3" w:name="_Toc239415426"/>
       <w:r>
         <w:t>The Ecosystem: How It Works</w:t>
       </w:r>
@@ -4091,7 +5228,7 @@
       <w:pPr>
         <w:pStyle w:val="Heading2"/>
       </w:pPr>
-      <w:bookmarkStart w:id="4" w:name="_Toc239257590"/>
+      <w:bookmarkStart w:id="4" w:name="_Toc239415427"/>
       <w:r>
         <w:t xml:space="preserve">The Brain: The </w:t>
       </w:r>
@@ -4124,7 +5261,7 @@
       <w:pPr>
         <w:pStyle w:val="Heading1"/>
       </w:pPr>
-      <w:bookmarkStart w:id="5" w:name="_Toc239257591"/>
+      <w:bookmarkStart w:id="5" w:name="_Toc239415428"/>
       <w:r>
         <w:t xml:space="preserve">Installation of </w:t>
       </w:r>
@@ -4190,7 +5327,7 @@
       <w:pPr>
         <w:pStyle w:val="Heading2"/>
       </w:pPr>
-      <w:bookmarkStart w:id="6" w:name="_Toc239257592"/>
+      <w:bookmarkStart w:id="6" w:name="_Toc239415429"/>
       <w:r>
         <w:t>Windows Installation</w:t>
       </w:r>
@@ -4492,7 +5629,7 @@
       <w:pPr>
         <w:pStyle w:val="Heading2"/>
       </w:pPr>
-      <w:bookmarkStart w:id="7" w:name="_Toc239257593"/>
+      <w:bookmarkStart w:id="7" w:name="_Toc239415430"/>
       <w:r>
         <w:t>Linux Installation (Ubuntu/Debian)</w:t>
       </w:r>
@@ -5309,7 +6446,7 @@
       <w:pPr>
         <w:pStyle w:val="Heading2"/>
       </w:pPr>
-      <w:bookmarkStart w:id="8" w:name="_Toc239257594"/>
+      <w:bookmarkStart w:id="8" w:name="_Toc239415431"/>
       <w:r>
         <w:t>macOS Installation</w:t>
       </w:r>
@@ -5384,7 +6521,7 @@
       <w:pPr>
         <w:pStyle w:val="Heading2"/>
       </w:pPr>
-      <w:bookmarkStart w:id="9" w:name="_Toc239257595"/>
+      <w:bookmarkStart w:id="9" w:name="_Toc239415432"/>
       <w:r>
         <w:t>Verifying Your Installation</w:t>
       </w:r>
@@ -5467,7 +6604,7 @@
       <w:pPr>
         <w:pStyle w:val="Heading1"/>
       </w:pPr>
-      <w:bookmarkStart w:id="10" w:name="_Toc239257596"/>
+      <w:bookmarkStart w:id="10" w:name="_Toc239415433"/>
       <w:r>
         <w:t xml:space="preserve">Navigating the </w:t>
       </w:r>
@@ -5519,7 +6656,7 @@
       <w:pPr>
         <w:pStyle w:val="Heading2"/>
       </w:pPr>
-      <w:bookmarkStart w:id="11" w:name="_Toc239257597"/>
+      <w:bookmarkStart w:id="11" w:name="_Toc239415434"/>
       <w:r>
         <w:t xml:space="preserve">Launching </w:t>
       </w:r>
@@ -5605,31 +6742,18 @@
       <w:pPr>
         <w:pStyle w:val="Caption"/>
       </w:pPr>
-      <w:bookmarkStart w:id="12" w:name="_Toc239257081"/>
+      <w:bookmarkStart w:id="12" w:name="_Toc239415450"/>
       <w:r>
         <w:t xml:space="preserve">Figure </w:t>
       </w:r>
-      <w:r>
-        <w:fldChar w:fldCharType="begin"/>
-      </w:r>
-      <w:r>
-        <w:instrText xml:space="preserve"> SEQ Figure \* ARABIC </w:instrText>
-      </w:r>
-      <w:r>
-        <w:fldChar w:fldCharType="separate"/>
-      </w:r>
-      <w:r>
-        <w:rPr>
-          <w:noProof/>
-        </w:rPr>
-        <w:t>1</w:t>
-      </w:r>
-      <w:r>
-        <w:rPr>
-          <w:noProof/>
-        </w:rPr>
-        <w:fldChar w:fldCharType="end"/>
-      </w:r>
+      <w:fldSimple w:instr=" SEQ Figure \* ARABIC ">
+        <w:r>
+          <w:rPr>
+            <w:noProof/>
+          </w:rPr>
+          <w:t>1</w:t>
+        </w:r>
+      </w:fldSimple>
       <w:r>
         <w:t xml:space="preserve"> </w:t>
       </w:r>
@@ -5647,7 +6771,7 @@
       <w:pPr>
         <w:pStyle w:val="Heading2"/>
       </w:pPr>
-      <w:bookmarkStart w:id="13" w:name="_Toc239257598"/>
+      <w:bookmarkStart w:id="13" w:name="_Toc239415435"/>
       <w:r>
         <w:t>The Main Window Layout</w:t>
       </w:r>
@@ -5724,27 +6848,18 @@
         <w:pStyle w:val="Caption"/>
         <w:ind w:firstLine="720"/>
       </w:pPr>
+      <w:bookmarkStart w:id="14" w:name="_Toc239415451"/>
       <w:r>
         <w:t xml:space="preserve">Figure </w:t>
       </w:r>
-      <w:r>
-        <w:fldChar w:fldCharType="begin"/>
-      </w:r>
-      <w:r>
-        <w:instrText xml:space="preserve"> SEQ Figure \* ARABIC </w:instrText>
-      </w:r>
-      <w:r>
-        <w:fldChar w:fldCharType="separate"/>
-      </w:r>
-      <w:r>
-        <w:rPr>
-          <w:noProof/>
-        </w:rPr>
-        <w:t>2</w:t>
-      </w:r>
-      <w:r>
-        <w:fldChar w:fldCharType="end"/>
-      </w:r>
+      <w:fldSimple w:instr=" SEQ Figure \* ARABIC ">
+        <w:r>
+          <w:rPr>
+            <w:noProof/>
+          </w:rPr>
+          <w:t>2</w:t>
+        </w:r>
+      </w:fldSimple>
       <w:r>
         <w:t xml:space="preserve"> Menu Ribbon of </w:t>
       </w:r>
@@ -5752,6 +6867,7 @@
       <w:r>
         <w:t>OMEdit</w:t>
       </w:r>
+      <w:bookmarkEnd w:id="14"/>
       <w:proofErr w:type="spellEnd"/>
     </w:p>
     <w:p>
@@ -5858,27 +6974,18 @@
         <w:pStyle w:val="Caption"/>
         <w:ind w:firstLine="720"/>
       </w:pPr>
+      <w:bookmarkStart w:id="15" w:name="_Toc239415452"/>
       <w:r>
         <w:t xml:space="preserve">Figure </w:t>
       </w:r>
-      <w:r>
-        <w:fldChar w:fldCharType="begin"/>
-      </w:r>
-      <w:r>
-        <w:instrText xml:space="preserve"> SEQ Figure \* ARABIC </w:instrText>
-      </w:r>
-      <w:r>
-        <w:fldChar w:fldCharType="separate"/>
-      </w:r>
-      <w:r>
-        <w:rPr>
-          <w:noProof/>
-        </w:rPr>
-        <w:t>3</w:t>
-      </w:r>
-      <w:r>
-        <w:fldChar w:fldCharType="end"/>
-      </w:r>
+      <w:fldSimple w:instr=" SEQ Figure \* ARABIC ">
+        <w:r>
+          <w:rPr>
+            <w:noProof/>
+          </w:rPr>
+          <w:t>3</w:t>
+        </w:r>
+      </w:fldSimple>
       <w:r>
         <w:t xml:space="preserve"> Toolbar of </w:t>
       </w:r>
@@ -5886,6 +6993,7 @@
       <w:r>
         <w:t>OMEdit</w:t>
       </w:r>
+      <w:bookmarkEnd w:id="15"/>
       <w:proofErr w:type="spellEnd"/>
     </w:p>
     <w:p>
@@ -5959,27 +7067,18 @@
         <w:pStyle w:val="Caption"/>
         <w:ind w:firstLine="720"/>
       </w:pPr>
+      <w:bookmarkStart w:id="16" w:name="_Toc239415453"/>
       <w:r>
         <w:t xml:space="preserve">Figure </w:t>
       </w:r>
-      <w:r>
-        <w:fldChar w:fldCharType="begin"/>
-      </w:r>
-      <w:r>
-        <w:instrText xml:space="preserve"> SEQ Figure \* ARABIC </w:instrText>
-      </w:r>
-      <w:r>
-        <w:fldChar w:fldCharType="separate"/>
-      </w:r>
-      <w:r>
-        <w:rPr>
-          <w:noProof/>
-        </w:rPr>
-        <w:t>4</w:t>
-      </w:r>
-      <w:r>
-        <w:fldChar w:fldCharType="end"/>
-      </w:r>
+      <w:fldSimple w:instr=" SEQ Figure \* ARABIC ">
+        <w:r>
+          <w:rPr>
+            <w:noProof/>
+          </w:rPr>
+          <w:t>4</w:t>
+        </w:r>
+      </w:fldSimple>
       <w:r>
         <w:t xml:space="preserve"> Libraries of </w:t>
       </w:r>
@@ -5987,6 +7086,7 @@
       <w:r>
         <w:t>OMEdit</w:t>
       </w:r>
+      <w:bookmarkEnd w:id="16"/>
       <w:proofErr w:type="spellEnd"/>
     </w:p>
     <w:p>
@@ -6092,27 +7192,18 @@
         <w:pStyle w:val="Caption"/>
         <w:ind w:firstLine="720"/>
       </w:pPr>
+      <w:bookmarkStart w:id="17" w:name="_Toc239415454"/>
       <w:r>
         <w:t xml:space="preserve">Figure </w:t>
       </w:r>
-      <w:r>
-        <w:fldChar w:fldCharType="begin"/>
-      </w:r>
-      <w:r>
-        <w:instrText xml:space="preserve"> SEQ Figure \* ARABIC </w:instrText>
-      </w:r>
-      <w:r>
-        <w:fldChar w:fldCharType="separate"/>
-      </w:r>
-      <w:r>
-        <w:rPr>
-          <w:noProof/>
-        </w:rPr>
-        <w:t>5</w:t>
-      </w:r>
-      <w:r>
-        <w:fldChar w:fldCharType="end"/>
-      </w:r>
+      <w:fldSimple w:instr=" SEQ Figure \* ARABIC ">
+        <w:r>
+          <w:rPr>
+            <w:noProof/>
+          </w:rPr>
+          <w:t>5</w:t>
+        </w:r>
+      </w:fldSimple>
       <w:r>
         <w:t xml:space="preserve"> Extended View of Libraries of </w:t>
       </w:r>
@@ -6120,6 +7211,7 @@
       <w:r>
         <w:t>OMEdit</w:t>
       </w:r>
+      <w:bookmarkEnd w:id="17"/>
       <w:proofErr w:type="spellEnd"/>
       <w:r>
         <w:t xml:space="preserve"> </w:t>
@@ -6334,30 +7426,22 @@
         <w:pStyle w:val="Caption"/>
         <w:ind w:firstLine="720"/>
       </w:pPr>
+      <w:bookmarkStart w:id="18" w:name="_Toc239415455"/>
       <w:r>
         <w:t xml:space="preserve">Figure </w:t>
       </w:r>
-      <w:r>
-        <w:fldChar w:fldCharType="begin"/>
-      </w:r>
-      <w:r>
-        <w:instrText xml:space="preserve"> SEQ Figure \* ARABIC </w:instrText>
-      </w:r>
-      <w:r>
-        <w:fldChar w:fldCharType="separate"/>
-      </w:r>
-      <w:r>
-        <w:rPr>
-          <w:noProof/>
-        </w:rPr>
-        <w:t>6</w:t>
-      </w:r>
-      <w:r>
-        <w:fldChar w:fldCharType="end"/>
-      </w:r>
+      <w:fldSimple w:instr=" SEQ Figure \* ARABIC ">
+        <w:r>
+          <w:rPr>
+            <w:noProof/>
+          </w:rPr>
+          <w:t>6</w:t>
+        </w:r>
+      </w:fldSimple>
       <w:r>
         <w:t xml:space="preserve"> Diagram View</w:t>
       </w:r>
+      <w:bookmarkEnd w:id="18"/>
     </w:p>
     <w:p>
       <w:pPr>
@@ -6455,30 +7539,22 @@
         <w:pStyle w:val="Caption"/>
         <w:ind w:firstLine="720"/>
       </w:pPr>
+      <w:bookmarkStart w:id="19" w:name="_Toc239415456"/>
       <w:r>
         <w:t xml:space="preserve">Figure </w:t>
       </w:r>
-      <w:r>
-        <w:fldChar w:fldCharType="begin"/>
-      </w:r>
-      <w:r>
-        <w:instrText xml:space="preserve"> SEQ Figure \* ARABIC </w:instrText>
-      </w:r>
-      <w:r>
-        <w:fldChar w:fldCharType="separate"/>
-      </w:r>
-      <w:r>
-        <w:rPr>
-          <w:noProof/>
-        </w:rPr>
-        <w:t>7</w:t>
-      </w:r>
-      <w:r>
-        <w:fldChar w:fldCharType="end"/>
-      </w:r>
+      <w:fldSimple w:instr=" SEQ Figure \* ARABIC ">
+        <w:r>
+          <w:rPr>
+            <w:noProof/>
+          </w:rPr>
+          <w:t>7</w:t>
+        </w:r>
+      </w:fldSimple>
       <w:r>
         <w:t xml:space="preserve"> Message Logs</w:t>
       </w:r>
+      <w:bookmarkEnd w:id="19"/>
     </w:p>
     <w:p>
       <w:pPr>
@@ -6544,11 +7620,11 @@
       <w:pPr>
         <w:pStyle w:val="Heading2"/>
       </w:pPr>
-      <w:bookmarkStart w:id="14" w:name="_Toc239257599"/>
+      <w:bookmarkStart w:id="20" w:name="_Toc239415436"/>
       <w:r>
         <w:t>Customizing Your Workspace</w:t>
       </w:r>
-      <w:bookmarkEnd w:id="14"/>
+      <w:bookmarkEnd w:id="20"/>
     </w:p>
     <w:p>
       <w:r>
@@ -6564,7 +7640,7 @@
       <w:pPr>
         <w:pStyle w:val="Heading1"/>
       </w:pPr>
-      <w:bookmarkStart w:id="15" w:name="_Toc239257600"/>
+      <w:bookmarkStart w:id="21" w:name="_Toc239415437"/>
       <w:r>
         <w:lastRenderedPageBreak/>
         <w:t>The Building Blocks</w:t>
@@ -6583,7 +7659,7 @@
       <w:r>
         <w:t xml:space="preserve"> Language Basics</w:t>
       </w:r>
-      <w:bookmarkEnd w:id="15"/>
+      <w:bookmarkEnd w:id="21"/>
     </w:p>
     <w:p>
       <w:r>
@@ -6623,11 +7699,11 @@
       <w:pPr>
         <w:pStyle w:val="Heading2"/>
       </w:pPr>
-      <w:bookmarkStart w:id="16" w:name="_Toc239257601"/>
+      <w:bookmarkStart w:id="22" w:name="_Toc239415438"/>
       <w:r>
         <w:t>Core Data Types</w:t>
       </w:r>
-      <w:bookmarkEnd w:id="16"/>
+      <w:bookmarkEnd w:id="22"/>
     </w:p>
     <w:p>
       <w:r>
@@ -6750,11 +7826,11 @@
       <w:pPr>
         <w:pStyle w:val="Heading2"/>
       </w:pPr>
-      <w:bookmarkStart w:id="17" w:name="_Toc239257602"/>
+      <w:bookmarkStart w:id="23" w:name="_Toc239415439"/>
       <w:r>
         <w:t>Structure of a Model</w:t>
       </w:r>
-      <w:bookmarkEnd w:id="17"/>
+      <w:bookmarkEnd w:id="23"/>
     </w:p>
     <w:p>
       <w:r>
@@ -6987,11 +8063,11 @@
       <w:pPr>
         <w:pStyle w:val="Heading1"/>
       </w:pPr>
-      <w:bookmarkStart w:id="18" w:name="_Toc239257603"/>
+      <w:bookmarkStart w:id="24" w:name="_Toc239415440"/>
       <w:r>
         <w:t>Creating and Writing a Model File</w:t>
       </w:r>
-      <w:bookmarkEnd w:id="18"/>
+      <w:bookmarkEnd w:id="24"/>
     </w:p>
     <w:p>
       <w:r>
@@ -7200,30 +8276,22 @@
         <w:pStyle w:val="Caption"/>
         <w:ind w:firstLine="720"/>
       </w:pPr>
+      <w:bookmarkStart w:id="25" w:name="_Toc239415457"/>
       <w:r>
         <w:t xml:space="preserve">Figure </w:t>
       </w:r>
-      <w:r>
-        <w:fldChar w:fldCharType="begin"/>
-      </w:r>
-      <w:r>
-        <w:instrText xml:space="preserve"> SEQ Figure \* ARABIC </w:instrText>
-      </w:r>
-      <w:r>
-        <w:fldChar w:fldCharType="separate"/>
-      </w:r>
-      <w:r>
-        <w:rPr>
-          <w:noProof/>
-        </w:rPr>
-        <w:t>8</w:t>
-      </w:r>
-      <w:r>
-        <w:fldChar w:fldCharType="end"/>
-      </w:r>
+      <w:fldSimple w:instr=" SEQ Figure \* ARABIC ">
+        <w:r>
+          <w:rPr>
+            <w:noProof/>
+          </w:rPr>
+          <w:t>8</w:t>
+        </w:r>
+      </w:fldSimple>
       <w:r>
         <w:t xml:space="preserve"> Canvas View of New Model</w:t>
       </w:r>
+      <w:bookmarkEnd w:id="25"/>
     </w:p>
     <w:p>
       <w:pPr>
@@ -7419,30 +8487,22 @@
           <w:rStyle w:val="Strong"/>
         </w:rPr>
       </w:pPr>
+      <w:bookmarkStart w:id="26" w:name="_Toc239415458"/>
       <w:r>
         <w:t xml:space="preserve">Figure </w:t>
       </w:r>
-      <w:r>
-        <w:fldChar w:fldCharType="begin"/>
-      </w:r>
-      <w:r>
-        <w:instrText xml:space="preserve"> SEQ Figure \* ARABIC </w:instrText>
-      </w:r>
-      <w:r>
-        <w:fldChar w:fldCharType="separate"/>
-      </w:r>
-      <w:r>
-        <w:rPr>
-          <w:noProof/>
-        </w:rPr>
-        <w:t>9</w:t>
-      </w:r>
-      <w:r>
-        <w:fldChar w:fldCharType="end"/>
-      </w:r>
+      <w:fldSimple w:instr=" SEQ Figure \* ARABIC ">
+        <w:r>
+          <w:rPr>
+            <w:noProof/>
+          </w:rPr>
+          <w:t>9</w:t>
+        </w:r>
+      </w:fldSimple>
       <w:r>
         <w:t xml:space="preserve"> Text View of the New Model</w:t>
       </w:r>
+      <w:bookmarkEnd w:id="26"/>
     </w:p>
     <w:p>
       <w:pPr>
@@ -7579,11 +8639,11 @@
       <w:pPr>
         <w:pStyle w:val="Heading2"/>
       </w:pPr>
-      <w:bookmarkStart w:id="19" w:name="_Toc239257604"/>
+      <w:bookmarkStart w:id="27" w:name="_Toc239415441"/>
       <w:r>
         <w:t>A Simple Code Block (The Time Function)</w:t>
       </w:r>
-      <w:bookmarkEnd w:id="19"/>
+      <w:bookmarkEnd w:id="27"/>
     </w:p>
     <w:p>
       <w:r>
@@ -7979,11 +9039,11 @@
       <w:pPr>
         <w:pStyle w:val="Heading2"/>
       </w:pPr>
-      <w:bookmarkStart w:id="20" w:name="_Toc239257605"/>
+      <w:bookmarkStart w:id="28" w:name="_Toc239415442"/>
       <w:r>
         <w:t>Understanding Packages and Modules</w:t>
       </w:r>
-      <w:bookmarkEnd w:id="20"/>
+      <w:bookmarkEnd w:id="28"/>
     </w:p>
     <w:p>
       <w:r>
@@ -8178,11 +9238,11 @@
       <w:pPr>
         <w:pStyle w:val="Heading2"/>
       </w:pPr>
-      <w:bookmarkStart w:id="21" w:name="_Toc239257606"/>
+      <w:bookmarkStart w:id="29" w:name="_Toc239415443"/>
       <w:r>
         <w:t>Running and Visualizing the Simple Code Block (A Preview)</w:t>
       </w:r>
-      <w:bookmarkEnd w:id="21"/>
+      <w:bookmarkEnd w:id="29"/>
     </w:p>
     <w:p>
       <w:r>
@@ -8256,30 +9316,22 @@
         <w:pStyle w:val="Caption"/>
         <w:ind w:firstLine="720"/>
       </w:pPr>
+      <w:bookmarkStart w:id="30" w:name="_Toc239415459"/>
       <w:r>
         <w:t xml:space="preserve">Figure </w:t>
       </w:r>
-      <w:r>
-        <w:fldChar w:fldCharType="begin"/>
-      </w:r>
-      <w:r>
-        <w:instrText xml:space="preserve"> SEQ Figure \* ARABIC </w:instrText>
-      </w:r>
-      <w:r>
-        <w:fldChar w:fldCharType="separate"/>
-      </w:r>
-      <w:r>
-        <w:rPr>
-          <w:noProof/>
-        </w:rPr>
-        <w:t>10</w:t>
-      </w:r>
-      <w:r>
-        <w:fldChar w:fldCharType="end"/>
-      </w:r>
+      <w:fldSimple w:instr=" SEQ Figure \* ARABIC ">
+        <w:r>
+          <w:rPr>
+            <w:noProof/>
+          </w:rPr>
+          <w:t>10</w:t>
+        </w:r>
+      </w:fldSimple>
       <w:r>
         <w:t xml:space="preserve"> Model Checks</w:t>
       </w:r>
+      <w:bookmarkEnd w:id="30"/>
     </w:p>
     <w:p>
       <w:pPr>
@@ -8371,30 +9423,22 @@
         <w:pStyle w:val="Caption"/>
         <w:ind w:firstLine="720"/>
       </w:pPr>
+      <w:bookmarkStart w:id="31" w:name="_Toc239415460"/>
       <w:r>
         <w:t xml:space="preserve">Figure </w:t>
       </w:r>
-      <w:r>
-        <w:fldChar w:fldCharType="begin"/>
-      </w:r>
-      <w:r>
-        <w:instrText xml:space="preserve"> SEQ Figure \* ARABIC </w:instrText>
-      </w:r>
-      <w:r>
-        <w:fldChar w:fldCharType="separate"/>
-      </w:r>
-      <w:r>
-        <w:rPr>
-          <w:noProof/>
-        </w:rPr>
-        <w:t>11</w:t>
-      </w:r>
-      <w:r>
-        <w:fldChar w:fldCharType="end"/>
-      </w:r>
+      <w:fldSimple w:instr=" SEQ Figure \* ARABIC ">
+        <w:r>
+          <w:rPr>
+            <w:noProof/>
+          </w:rPr>
+          <w:t>11</w:t>
+        </w:r>
+      </w:fldSimple>
       <w:r>
         <w:t xml:space="preserve"> Logs Checks</w:t>
       </w:r>
+      <w:bookmarkEnd w:id="31"/>
     </w:p>
     <w:p>
       <w:pPr>
@@ -8464,30 +9508,22 @@
         <w:pStyle w:val="Caption"/>
         <w:ind w:firstLine="720"/>
       </w:pPr>
+      <w:bookmarkStart w:id="32" w:name="_Toc239415461"/>
       <w:r>
         <w:t xml:space="preserve">Figure </w:t>
       </w:r>
-      <w:r>
-        <w:fldChar w:fldCharType="begin"/>
-      </w:r>
-      <w:r>
-        <w:instrText xml:space="preserve"> SEQ Figure \* ARABIC </w:instrText>
-      </w:r>
-      <w:r>
-        <w:fldChar w:fldCharType="separate"/>
-      </w:r>
-      <w:r>
-        <w:rPr>
-          <w:noProof/>
-        </w:rPr>
-        <w:t>12</w:t>
-      </w:r>
-      <w:r>
-        <w:fldChar w:fldCharType="end"/>
-      </w:r>
+      <w:fldSimple w:instr=" SEQ Figure \* ARABIC ">
+        <w:r>
+          <w:rPr>
+            <w:noProof/>
+          </w:rPr>
+          <w:t>12</w:t>
+        </w:r>
+      </w:fldSimple>
       <w:r>
         <w:t xml:space="preserve"> Simulate</w:t>
       </w:r>
+      <w:bookmarkEnd w:id="32"/>
     </w:p>
     <w:p>
       <w:pPr>
@@ -8561,30 +9597,22 @@
         <w:pStyle w:val="Caption"/>
         <w:ind w:firstLine="720"/>
       </w:pPr>
+      <w:bookmarkStart w:id="33" w:name="_Toc239415462"/>
       <w:r>
         <w:t xml:space="preserve">Figure </w:t>
       </w:r>
-      <w:r>
-        <w:fldChar w:fldCharType="begin"/>
-      </w:r>
-      <w:r>
-        <w:instrText xml:space="preserve"> SEQ Figure \* ARABIC </w:instrText>
-      </w:r>
-      <w:r>
-        <w:fldChar w:fldCharType="separate"/>
-      </w:r>
-      <w:r>
-        <w:rPr>
-          <w:noProof/>
-        </w:rPr>
-        <w:t>13</w:t>
-      </w:r>
-      <w:r>
-        <w:fldChar w:fldCharType="end"/>
-      </w:r>
+      <w:fldSimple w:instr=" SEQ Figure \* ARABIC ">
+        <w:r>
+          <w:rPr>
+            <w:noProof/>
+          </w:rPr>
+          <w:t>13</w:t>
+        </w:r>
+      </w:fldSimple>
       <w:r>
         <w:t xml:space="preserve"> Simulation Setup</w:t>
       </w:r>
+      <w:bookmarkEnd w:id="33"/>
     </w:p>
     <w:p>
       <w:pPr>
@@ -8666,36 +9694,28 @@
         <w:pStyle w:val="Caption"/>
         <w:ind w:firstLine="720"/>
       </w:pPr>
+      <w:bookmarkStart w:id="34" w:name="_Toc239415463"/>
       <w:r>
         <w:t xml:space="preserve">Figure </w:t>
       </w:r>
-      <w:r>
-        <w:fldChar w:fldCharType="begin"/>
-      </w:r>
-      <w:r>
-        <w:instrText xml:space="preserve"> SEQ Figure \* ARABIC </w:instrText>
-      </w:r>
-      <w:r>
-        <w:fldChar w:fldCharType="separate"/>
-      </w:r>
-      <w:r>
-        <w:rPr>
-          <w:noProof/>
-        </w:rPr>
-        <w:t>14</w:t>
-      </w:r>
-      <w:r>
-        <w:fldChar w:fldCharType="end"/>
-      </w:r>
+      <w:fldSimple w:instr=" SEQ Figure \* ARABIC ">
+        <w:r>
+          <w:rPr>
+            <w:noProof/>
+          </w:rPr>
+          <w:t>14</w:t>
+        </w:r>
+      </w:fldSimple>
       <w:r>
         <w:t xml:space="preserve"> Plots</w:t>
       </w:r>
+      <w:bookmarkEnd w:id="34"/>
     </w:p>
     <w:p>
       <w:pPr>
         <w:pStyle w:val="Heading1"/>
       </w:pPr>
-      <w:bookmarkStart w:id="22" w:name="_Toc239257607"/>
+      <w:bookmarkStart w:id="35" w:name="_Toc239415444"/>
       <w:r>
         <w:t>Exporting Simulation Data</w:t>
       </w:r>
@@ -8713,7 +9733,7 @@
         </w:rPr>
         <w:t>SimpleRamp</w:t>
       </w:r>
-      <w:bookmarkEnd w:id="22"/>
+      <w:bookmarkEnd w:id="35"/>
       <w:proofErr w:type="spellEnd"/>
     </w:p>
     <w:p>
@@ -8773,11 +9793,11 @@
       <w:pPr>
         <w:pStyle w:val="Heading2"/>
       </w:pPr>
-      <w:bookmarkStart w:id="23" w:name="_Toc239257608"/>
+      <w:bookmarkStart w:id="36" w:name="_Toc239415445"/>
       <w:r>
         <w:t>Setting Up Our Test Case</w:t>
       </w:r>
-      <w:bookmarkEnd w:id="23"/>
+      <w:bookmarkEnd w:id="36"/>
     </w:p>
     <w:p>
       <w:r>
@@ -9076,11 +10096,11 @@
       <w:pPr>
         <w:pStyle w:val="Heading2"/>
       </w:pPr>
-      <w:bookmarkStart w:id="24" w:name="_Toc239257609"/>
+      <w:bookmarkStart w:id="37" w:name="_Toc239415446"/>
       <w:r>
         <w:t>Understanding the Simulation Output Files (Where is my data?)</w:t>
       </w:r>
-      <w:bookmarkEnd w:id="24"/>
+      <w:bookmarkEnd w:id="37"/>
     </w:p>
     <w:p>
       <w:r>
@@ -9209,30 +10229,22 @@
         <w:pStyle w:val="Caption"/>
         <w:ind w:firstLine="720"/>
       </w:pPr>
+      <w:bookmarkStart w:id="38" w:name="_Toc239415464"/>
       <w:r>
         <w:t xml:space="preserve">Figure </w:t>
       </w:r>
-      <w:r>
-        <w:fldChar w:fldCharType="begin"/>
-      </w:r>
-      <w:r>
-        <w:instrText xml:space="preserve"> SEQ Figure \* ARABIC </w:instrText>
-      </w:r>
-      <w:r>
-        <w:fldChar w:fldCharType="separate"/>
-      </w:r>
-      <w:r>
-        <w:rPr>
-          <w:noProof/>
-        </w:rPr>
-        <w:t>15</w:t>
-      </w:r>
-      <w:r>
-        <w:fldChar w:fldCharType="end"/>
-      </w:r>
+      <w:fldSimple w:instr=" SEQ Figure \* ARABIC ">
+        <w:r>
+          <w:rPr>
+            <w:noProof/>
+          </w:rPr>
+          <w:t>15</w:t>
+        </w:r>
+      </w:fldSimple>
       <w:r>
         <w:t xml:space="preserve"> Output File</w:t>
       </w:r>
+      <w:bookmarkEnd w:id="38"/>
     </w:p>
     <w:p>
       <w:r>
@@ -9273,11 +10285,11 @@
       <w:pPr>
         <w:pStyle w:val="Heading2"/>
       </w:pPr>
-      <w:bookmarkStart w:id="25" w:name="_Toc239257610"/>
+      <w:bookmarkStart w:id="39" w:name="_Toc239415447"/>
       <w:r>
         <w:t>Export Method 1: The Graphical Export (Plots)</w:t>
       </w:r>
-      <w:bookmarkEnd w:id="25"/>
+      <w:bookmarkEnd w:id="39"/>
     </w:p>
     <w:p>
       <w:r>
@@ -9389,30 +10401,22 @@
         <w:pStyle w:val="Caption"/>
         <w:ind w:firstLine="720"/>
       </w:pPr>
+      <w:bookmarkStart w:id="40" w:name="_Toc239415465"/>
       <w:r>
         <w:t xml:space="preserve">Figure </w:t>
       </w:r>
-      <w:r>
-        <w:fldChar w:fldCharType="begin"/>
-      </w:r>
-      <w:r>
-        <w:instrText xml:space="preserve"> SEQ Figure \* ARABIC </w:instrText>
-      </w:r>
-      <w:r>
-        <w:fldChar w:fldCharType="separate"/>
-      </w:r>
-      <w:r>
-        <w:rPr>
-          <w:noProof/>
-        </w:rPr>
-        <w:t>16</w:t>
-      </w:r>
-      <w:r>
-        <w:fldChar w:fldCharType="end"/>
-      </w:r>
+      <w:fldSimple w:instr=" SEQ Figure \* ARABIC ">
+        <w:r>
+          <w:rPr>
+            <w:noProof/>
+          </w:rPr>
+          <w:t>16</w:t>
+        </w:r>
+      </w:fldSimple>
       <w:r>
         <w:t xml:space="preserve"> Plots Display</w:t>
       </w:r>
+      <w:bookmarkEnd w:id="40"/>
     </w:p>
     <w:p>
       <w:pPr>
@@ -9562,11 +10566,11 @@
       <w:pPr>
         <w:pStyle w:val="Heading2"/>
       </w:pPr>
-      <w:bookmarkStart w:id="26" w:name="_Toc239257611"/>
+      <w:bookmarkStart w:id="41" w:name="_Toc239415448"/>
       <w:r>
         <w:t>Export Method 2: The CSV (Comma Separated Values) Export</w:t>
       </w:r>
-      <w:bookmarkEnd w:id="26"/>
+      <w:bookmarkEnd w:id="41"/>
     </w:p>
     <w:p>
       <w:r>
@@ -9695,30 +10699,22 @@
         <w:pStyle w:val="Caption"/>
         <w:ind w:firstLine="720"/>
       </w:pPr>
+      <w:bookmarkStart w:id="42" w:name="_Toc239415466"/>
       <w:r>
         <w:t xml:space="preserve">Figure </w:t>
       </w:r>
-      <w:r>
-        <w:fldChar w:fldCharType="begin"/>
-      </w:r>
-      <w:r>
-        <w:instrText xml:space="preserve"> SEQ Figure \* ARABIC </w:instrText>
-      </w:r>
-      <w:r>
-        <w:fldChar w:fldCharType="separate"/>
-      </w:r>
-      <w:r>
-        <w:rPr>
-          <w:noProof/>
-        </w:rPr>
-        <w:t>17</w:t>
-      </w:r>
-      <w:r>
-        <w:fldChar w:fldCharType="end"/>
-      </w:r>
+      <w:fldSimple w:instr=" SEQ Figure \* ARABIC ">
+        <w:r>
+          <w:rPr>
+            <w:noProof/>
+          </w:rPr>
+          <w:t>17</w:t>
+        </w:r>
+      </w:fldSimple>
       <w:r>
         <w:t xml:space="preserve"> Tool Ribbon to export results as CSV</w:t>
       </w:r>
+      <w:bookmarkEnd w:id="42"/>
     </w:p>
     <w:p>
       <w:pPr>
@@ -9876,11 +10872,11 @@
       <w:pPr>
         <w:pStyle w:val="Heading1"/>
       </w:pPr>
-      <w:bookmarkStart w:id="27" w:name="_Toc239257612"/>
+      <w:bookmarkStart w:id="43" w:name="_Toc239415449"/>
       <w:r>
         <w:t>References and Source Code</w:t>
       </w:r>
-      <w:bookmarkEnd w:id="27"/>
+      <w:bookmarkEnd w:id="43"/>
     </w:p>
     <w:p>
       <w:pPr>

</xml_diff>